<commit_message>
docs: reformulate Chapter 4 costs and ROI with MXN Jr salary baselines
</commit_message>
<xml_diff>
--- a/ESTADIAS 75% AVANCE V2..docx
+++ b/ESTADIAS 75% AVANCE V2..docx
@@ -18463,37 +18463,7 @@
         <w:rPr>
           <w:rFonts w:cs="Tahoma"/>
         </w:rPr>
-        <w:t>En tercer lugar, se transmite una petición de actualización para modificar el estado de dicha orden ajena</w:t>
-      </w:r>
-      <w:r>
-        <w:rPr>
-          <w:rFonts w:cs="Tahoma"/>
-        </w:rPr>
-        <w:t>. E</w:t>
-      </w:r>
-      <w:r>
-        <w:rPr>
-          <w:rFonts w:cs="Tahoma"/>
-        </w:rPr>
-        <w:t xml:space="preserve">l sistema responde de forma segura bloqueando el suceso: el Técnico A solo visualiza sus registros en el frontend, la consulta directa del registro ajeno devuelve un conjunto vacío y la solicitud de modificación es rechazada por el motor de base de datos debido a que la política RLS invalida la operación a nivel de fila. El resultado </w:t>
-      </w:r>
-      <w:r>
-        <w:rPr>
-          <w:rFonts w:cs="Tahoma"/>
-        </w:rPr>
-        <w:t xml:space="preserve">se visualiza en la figura 25, y </w:t>
-      </w:r>
-      <w:r>
-        <w:rPr>
-          <w:rFonts w:cs="Tahoma"/>
-        </w:rPr>
-        <w:t>confirma</w:t>
-      </w:r>
-      <w:r>
-        <w:rPr>
-          <w:rFonts w:cs="Tahoma"/>
-        </w:rPr>
-        <w:t xml:space="preserve"> que la seguridad de los datos se encuentra segura desde el motor de base de datos.</w:t>
+        <w:t>En tercer lugar, se transmite una petición de actualización para modificar el estado de dicha orden ajena. El sistema responde de forma segura bloqueando el suceso: el Técnico A solo visualiza sus registros en el frontend, la consulta directa del registro ajeno devuelve un conjunto vacío y la solicitud de modificación es rechazada por el motor de base de datos debido a que la política RLS invalida la operación a nivel de fila. El resultado se visualiza en la figura 25, y confirma que la seguridad de los datos se encuentra segura desde el motor de base de datos.</w:t>
       </w:r>
     </w:p>
     <w:p>
@@ -19193,6 +19163,7 @@
       <w:r>
         <w:rPr>
           <w:rFonts w:cs="Tahoma"/>
+          <w:noProof/>
         </w:rPr>
         <w:drawing>
           <wp:inline distT="0" distB="0" distL="0" distR="0" wp14:anchorId="5CB1EE62" wp14:editId="0844EC67">
@@ -20877,100 +20848,64 @@
         <w:rPr>
           <w:rFonts w:cs="Tahoma"/>
         </w:rPr>
-        <w:t xml:space="preserve"> y el manifiesto PWA soluciona el problema de disponibilidad de interfaz en zonas de baja cobertura</w:t>
-      </w:r>
-      <w:r>
+        <w:t xml:space="preserve"> y el manifiesto PWA soluciona el problema de disponibilidad de interfaz en zonas de baja cobertura.</w:t>
+      </w:r>
+    </w:p>
+    <w:p>
+      <w:pPr>
         <w:rPr>
           <w:rFonts w:cs="Tahoma"/>
-        </w:rPr>
-        <w:t>.</w:t>
-      </w:r>
-    </w:p>
-    <w:p>
-      <w:pPr>
+          <w:lang w:eastAsia="es-MX"/>
+        </w:rPr>
+      </w:pPr>
+    </w:p>
+    <w:p>
+      <w:pPr>
+        <w:spacing w:after="120"/>
         <w:rPr>
           <w:rFonts w:cs="Tahoma"/>
-          <w:lang w:eastAsia="es-MX"/>
-        </w:rPr>
-      </w:pPr>
-    </w:p>
-    <w:p>
-      <w:pPr>
-        <w:spacing w:after="120"/>
+        </w:rPr>
+      </w:pPr>
+      <w:r>
         <w:rPr>
           <w:rFonts w:cs="Tahoma"/>
         </w:rPr>
-      </w:pPr>
+        <w:t>Sin embargo, durante las actividades de monitoreo se detectan áreas críticas de mejora en el sistema original. Primero, el tamaño excesivo de las fotografías capturadas por dispositivos móviles de gama alta (que alcanzan pesos de entre cinco y diez megabytes) provoca retrasos severos y tiempos de espera excedidos (</w:t>
+      </w:r>
+      <w:proofErr w:type="spellStart"/>
       <w:r>
         <w:rPr>
           <w:rFonts w:cs="Tahoma"/>
         </w:rPr>
-        <w:t>Sin embargo, d</w:t>
-      </w:r>
+        <w:t>timeouts</w:t>
+      </w:r>
+      <w:proofErr w:type="spellEnd"/>
       <w:r>
         <w:rPr>
           <w:rFonts w:cs="Tahoma"/>
         </w:rPr>
-        <w:t>urante las actividades de monitoreo se detectan áreas críticas de mejora en el sistema original</w:t>
-      </w:r>
+        <w:t xml:space="preserve">) de red al intentar la subida a </w:t>
+      </w:r>
+      <w:proofErr w:type="spellStart"/>
       <w:r>
         <w:rPr>
           <w:rFonts w:cs="Tahoma"/>
         </w:rPr>
-        <w:t>. Primero, e</w:t>
-      </w:r>
+        <w:t>Supabase</w:t>
+      </w:r>
+      <w:proofErr w:type="spellEnd"/>
       <w:r>
         <w:rPr>
           <w:rFonts w:cs="Tahoma"/>
         </w:rPr>
-        <w:t>l tamaño excesivo de las fotografías capturadas por dispositivos móviles de gama alta (que alcanzan pesos de entre cinco y diez megabytes) provoca retrasos severos y tiempos de espera excedidos (</w:t>
-      </w:r>
-      <w:proofErr w:type="spellStart"/>
+        <w:t xml:space="preserve"> Storage bajo conexiones </w:t>
+      </w:r>
       <w:r>
         <w:rPr>
           <w:rFonts w:cs="Tahoma"/>
         </w:rPr>
-        <w:t>timeouts</w:t>
-      </w:r>
-      <w:proofErr w:type="spellEnd"/>
-      <w:r>
-        <w:rPr>
-          <w:rFonts w:cs="Tahoma"/>
-        </w:rPr>
-        <w:t xml:space="preserve">) de red al intentar la subida a </w:t>
-      </w:r>
-      <w:proofErr w:type="spellStart"/>
-      <w:r>
-        <w:rPr>
-          <w:rFonts w:cs="Tahoma"/>
-        </w:rPr>
-        <w:t>Supabase</w:t>
-      </w:r>
-      <w:proofErr w:type="spellEnd"/>
-      <w:r>
-        <w:rPr>
-          <w:rFonts w:cs="Tahoma"/>
-        </w:rPr>
-        <w:t xml:space="preserve"> Storage bajo conexiones </w:t>
-      </w:r>
-      <w:r>
-        <w:rPr>
-          <w:rFonts w:cs="Tahoma"/>
-        </w:rPr>
         <w:lastRenderedPageBreak/>
-        <w:t>móviles inestables (3G o 4G débiles)</w:t>
-      </w:r>
-      <w:r>
-        <w:rPr>
-          <w:rFonts w:cs="Tahoma"/>
-        </w:rPr>
-        <w:t>. También se detecta que l</w:t>
-      </w:r>
-      <w:r>
-        <w:rPr>
-          <w:rFonts w:cs="Tahoma"/>
-        </w:rPr>
-        <w:t>a respuesta del GPS y el manejo de permisos del navegador presentan puntos vulnerables; si el técnico de campo rechaza de forma accidental el acceso a la geolocalización o si la señal del satélite demora más de diez segundos en retornar coordenadas, la interfaz se congela o devuelve errores genéricos no controlados, interrumpiendo el flujo operativo.</w:t>
+        <w:t>móviles inestables (3G o 4G débiles). También se detecta que la respuesta del GPS y el manejo de permisos del navegador presentan puntos vulnerables; si el técnico de campo rechaza de forma accidental el acceso a la geolocalización o si la señal del satélite demora más de diez segundos en retornar coordenadas, la interfaz se congela o devuelve errores genéricos no controlados, interrumpiendo el flujo operativo.</w:t>
       </w:r>
     </w:p>
     <w:p>
@@ -21395,7 +21330,21 @@
           <w:rFonts w:ascii="Arial" w:hAnsi="Arial"/>
           <w:sz w:val="24"/>
         </w:rPr>
-        <w:t>La evaluación financiera de la solución tecnológica abarca únicamente aquellos elementos adquiridos de forma exclusiva para el desarrollo, pruebas e implementación de la aplicación web, omitiendo los recursos preexistentes de la organización (como computadoras de escritorio, acceso a internet del taller y licencias generales). En la Tabla 5 se presenta el desglose detallado de los conceptos financieros del proyecto expresados en Dólares de los Estados Unidos (USD).</w:t>
+        <w:t>La evaluación financiera de la solución tecnológica abarca únicamente aquellos conceptos directamente asociados con el diseño y la programación de la aplicación. De acuerdo con las pautas del análisis de viabilidad, se excluyen los recursos preexistentes de la organización que son utilizados en sus operaciones cotidianas (como el equipo de cómputo proporcionado por la empresa, el suministro eléctrico, la conexión a internet de la planta y los dispositivos móviles de los operarios).</w:t>
+      </w:r>
+    </w:p>
+    <w:p>
+      <w:pPr>
+        <w:spacing w:line="360" w:lineRule="auto" w:before="0" w:after="120"/>
+        <w:ind w:left="0" w:firstLine="0"/>
+        <w:jc w:val="both"/>
+      </w:pPr>
+      <w:r>
+        <w:rPr>
+          <w:rFonts w:ascii="Arial" w:hAnsi="Arial"/>
+          <w:sz w:val="24"/>
+        </w:rPr>
+        <w:t>Asimismo, al tratarse de un proyecto de estadías académicas ejecutado bajo la modalidad de prácticas profesionales, la organización no realiza ningún desembolso real por concepto de sueldo o contratación externa. No obstante, para efectos del presupuesto analítico del proyecto y la valoración del software en el mercado, se integra una estimación basada en el salario mínimo promedio mensual que recibe un Desarrollador Junior (Jr) en México, el cual se establece en $12000.00 Pesos Mexicanos (MXN). En la Tabla 5 se resume el costo teórico de inversión del proyecto de mejora.</w:t>
       </w:r>
     </w:p>
     <w:p>
@@ -21495,7 +21444,7 @@
                 <w:b/>
                 <w:sz w:val="20"/>
               </w:rPr>
-              <w:t>Costo (USD)</w:t>
+              <w:t>Costo (MXN)</w:t>
             </w:r>
           </w:p>
         </w:tc>
@@ -21515,7 +21464,7 @@
                 <w:rFonts w:ascii="Arial" w:hAnsi="Arial"/>
                 <w:sz w:val="20"/>
               </w:rPr>
-              <w:t>Dispositivo móvil robusto</w:t>
+              <w:t>Mano de obra de desarrollo</w:t>
             </w:r>
           </w:p>
         </w:tc>
@@ -21533,7 +21482,7 @@
                 <w:rFonts w:ascii="Arial" w:hAnsi="Arial"/>
                 <w:sz w:val="20"/>
               </w:rPr>
-              <w:t>Hardware</w:t>
+              <w:t>Servicio profesional</w:t>
             </w:r>
           </w:p>
         </w:tc>
@@ -21551,7 +21500,7 @@
                 <w:rFonts w:ascii="Arial" w:hAnsi="Arial"/>
                 <w:sz w:val="20"/>
               </w:rPr>
-              <w:t>Dispositivo móvil para pruebas operativas en el taller</w:t>
+              <w:t>Honorarios de programación basados en el salario mensual de un Desarrollador Jr en México ($12000.00 MXN mensuales por 4 meses)</w:t>
             </w:r>
           </w:p>
         </w:tc>
@@ -21569,7 +21518,7 @@
                 <w:rFonts w:ascii="Arial" w:hAnsi="Arial"/>
                 <w:sz w:val="20"/>
               </w:rPr>
-              <w:t>250.00</w:t>
+              <w:t>48000.00</w:t>
             </w:r>
           </w:p>
         </w:tc>
@@ -21589,7 +21538,7 @@
                 <w:rFonts w:ascii="Arial" w:hAnsi="Arial"/>
                 <w:sz w:val="20"/>
               </w:rPr>
-              <w:t>Suscripción Supabase Pro</w:t>
+              <w:t>Infraestructura en la nube</w:t>
             </w:r>
           </w:p>
         </w:tc>
@@ -21625,7 +21574,7 @@
                 <w:rFonts w:ascii="Arial" w:hAnsi="Arial"/>
                 <w:sz w:val="20"/>
               </w:rPr>
-              <w:t>Infraestructura y base de datos relacional (2 meses)</w:t>
+              <w:t>Servidores y base de datos relacional (Plan gratuito de Supabase y Vercel)</w:t>
             </w:r>
           </w:p>
         </w:tc>
@@ -21643,7 +21592,7 @@
                 <w:rFonts w:ascii="Arial" w:hAnsi="Arial"/>
                 <w:sz w:val="20"/>
               </w:rPr>
-              <w:t>50.00</w:t>
+              <w:t>0.00</w:t>
             </w:r>
           </w:p>
         </w:tc>
@@ -21663,7 +21612,7 @@
                 <w:rFonts w:ascii="Arial" w:hAnsi="Arial"/>
                 <w:sz w:val="20"/>
               </w:rPr>
-              <w:t>Licencia Google Play Console</w:t>
+              <w:t>Dispositivos y conectividad</w:t>
             </w:r>
           </w:p>
         </w:tc>
@@ -21681,7 +21630,7 @@
                 <w:rFonts w:ascii="Arial" w:hAnsi="Arial"/>
                 <w:sz w:val="20"/>
               </w:rPr>
-              <w:t>Licencia</w:t>
+              <w:t>Hardware / Red</w:t>
             </w:r>
           </w:p>
         </w:tc>
@@ -21699,7 +21648,7 @@
                 <w:rFonts w:ascii="Arial" w:hAnsi="Arial"/>
                 <w:sz w:val="20"/>
               </w:rPr>
-              <w:t>Registro de desarrollador para la distribución de la PWA</w:t>
+              <w:t>Equipos de prueba y conectividad móvil provistos por la organización</w:t>
             </w:r>
           </w:p>
         </w:tc>
@@ -21717,7 +21666,7 @@
                 <w:rFonts w:ascii="Arial" w:hAnsi="Arial"/>
                 <w:sz w:val="20"/>
               </w:rPr>
-              <w:t>25.00</w:t>
+              <w:t>0.00</w:t>
             </w:r>
           </w:p>
         </w:tc>
@@ -21737,7 +21686,7 @@
                 <w:rFonts w:ascii="Arial" w:hAnsi="Arial"/>
                 <w:sz w:val="20"/>
               </w:rPr>
-              <w:t>Mano de obra de desarrollo</w:t>
+              <w:t>Total de la inversión</w:t>
             </w:r>
           </w:p>
         </w:tc>
@@ -21755,7 +21704,7 @@
                 <w:rFonts w:ascii="Arial" w:hAnsi="Arial"/>
                 <w:sz w:val="20"/>
               </w:rPr>
-              <w:t>Servicio profesional</w:t>
+              <w:t>Finanzas</w:t>
             </w:r>
           </w:p>
         </w:tc>
@@ -21773,7 +21722,7 @@
                 <w:rFonts w:ascii="Arial" w:hAnsi="Arial"/>
                 <w:sz w:val="20"/>
               </w:rPr>
-              <w:t>320 horas de programación e implementación</w:t>
+              <w:t>Costo total valorado del proyecto de mejora</w:t>
             </w:r>
           </w:p>
         </w:tc>
@@ -21791,81 +21740,7 @@
                 <w:rFonts w:ascii="Arial" w:hAnsi="Arial"/>
                 <w:sz w:val="20"/>
               </w:rPr>
-              <w:t>4800.00</w:t>
-            </w:r>
-          </w:p>
-        </w:tc>
-      </w:tr>
-      <w:tr>
-        <w:tc>
-          <w:tcPr>
-            <w:tcW w:type="dxa" w:w="2592"/>
-          </w:tcPr>
-          <w:p>
-            <w:pPr>
-              <w:spacing w:before="60" w:after="60"/>
-              <w:jc w:val="left"/>
-            </w:pPr>
-            <w:r>
-              <w:rPr>
-                <w:rFonts w:ascii="Arial" w:hAnsi="Arial"/>
-                <w:sz w:val="20"/>
-              </w:rPr>
-              <w:t>Total de la inversión</w:t>
-            </w:r>
-          </w:p>
-        </w:tc>
-        <w:tc>
-          <w:tcPr>
-            <w:tcW w:type="dxa" w:w="1728"/>
-          </w:tcPr>
-          <w:p>
-            <w:pPr>
-              <w:spacing w:before="60" w:after="60"/>
-              <w:jc w:val="left"/>
-            </w:pPr>
-            <w:r>
-              <w:rPr>
-                <w:rFonts w:ascii="Arial" w:hAnsi="Arial"/>
-                <w:sz w:val="20"/>
-              </w:rPr>
-              <w:t>Finanzas</w:t>
-            </w:r>
-          </w:p>
-        </w:tc>
-        <w:tc>
-          <w:tcPr>
-            <w:tcW w:type="dxa" w:w="4608"/>
-          </w:tcPr>
-          <w:p>
-            <w:pPr>
-              <w:spacing w:before="60" w:after="60"/>
-              <w:jc w:val="left"/>
-            </w:pPr>
-            <w:r>
-              <w:rPr>
-                <w:rFonts w:ascii="Arial" w:hAnsi="Arial"/>
-                <w:sz w:val="20"/>
-              </w:rPr>
-              <w:t>Costo total del proyecto de mejora</w:t>
-            </w:r>
-          </w:p>
-        </w:tc>
-        <w:tc>
-          <w:tcPr>
-            <w:tcW w:type="dxa" w:w="1440"/>
-          </w:tcPr>
-          <w:p>
-            <w:pPr>
-              <w:spacing w:before="60" w:after="60"/>
-              <w:jc w:val="left"/>
-            </w:pPr>
-            <w:r>
-              <w:rPr>
-                <w:rFonts w:ascii="Arial" w:hAnsi="Arial"/>
-                <w:sz w:val="20"/>
-              </w:rPr>
-              <w:t>5125.00</w:t>
+              <w:t>48000.00</w:t>
             </w:r>
           </w:p>
         </w:tc>
@@ -21882,7 +21757,7 @@
           <w:rFonts w:ascii="Arial" w:hAnsi="Arial"/>
           <w:sz w:val="24"/>
         </w:rPr>
-        <w:t>La inversión inicial de 5125.00 USD representa el costo de capital requerido para transicionar de la gestión tradicional hacia la plataforma digital automatizada, cubriendo el hardware de pruebas, el soporte en la nube y el tiempo de ingeniería de software dedicado al diseño.</w:t>
+        <w:t>La valoración de 48000.00 MXN constituye la inversión teórica acumulada del proyecto de desarrollo de software, aunque el desembolso neto real de capital por parte de la empresa para la implementación de la aplicación web equivale a 0.00 MXN.</w:t>
       </w:r>
     </w:p>
     <w:p>
@@ -22410,7 +22285,7 @@
           <w:rFonts w:ascii="Arial" w:hAnsi="Arial"/>
           <w:sz w:val="24"/>
         </w:rPr>
-        <w:t>En primer lugar, se evalúa el ahorro en tiempo de trabajo administrativo. La reducción de dos horas de papeleo por orden de servicio, en un flujo promedio de 150 órdenes mensuales, genera un ahorro mensual de 300 horas laborales. Considerando un costo por hora de mano de obra administrativa de 8.00 USD, el ahorro mensual directo es de 2400.00 USD. Asimismo, el control estricto de consumos de insumos en sitio evita la pérdida y merma no registrada de repuestos y materiales de motores, aportando un ahorro adicional estimado en 350.00 USD al mes. De este modo, el beneficio económico mensual consolidado para la organización asciende a 2750.00 USD.</w:t>
+        <w:t>En primer lugar, se determina el beneficio económico mensual. La reducción de dos horas de papeleo por orden de servicio, en un flujo de trabajo de 150 órdenes mensuales, representa un ahorro de 300 horas al mes. Considerando un costo por hora de mano de obra de auxiliar administrativo en México de $45.00 MXN (basado en un sueldo mensual promedio de $8000.00 MXN por 180 horas de jornada laboral), el ahorro mensual directo por mano de obra equivale a $13500.00 MXN. A esta cifra se adiciona un ahorro promedio mensual estimado de $2000.00 MXN derivado del control exacto de consumos de insumos en sitio, lo cual evita pérdidas de repuestos y materiales de motores. De esta manera, el ahorro mensual total consolidado asciende a $15500.00 MXN.</w:t>
       </w:r>
     </w:p>
     <w:p>
@@ -22424,7 +22299,49 @@
           <w:rFonts w:ascii="Arial" w:hAnsi="Arial"/>
           <w:sz w:val="24"/>
         </w:rPr>
-        <w:t>En segundo lugar, se determina el tiempo de recuperación de la inversión dividiendo el costo total del proyecto (5125.00 USD) entre el beneficio económico mensual neto (2750.00 USD). El cálculo arroja un periodo de 1.86 meses, lo que equivale a aproximadamente 1 mes y 26 días para recuperar la totalidad del capital invertido en el software.</w:t>
+        <w:t>En segundo lugar, se analiza el periodo de recuperación de la inversión desde dos enfoques contables distintos:</w:t>
+      </w:r>
+    </w:p>
+    <w:p>
+      <w:pPr>
+        <w:spacing w:line="360" w:lineRule="auto" w:before="0" w:after="80"/>
+        <w:ind w:left="576" w:hanging="288"/>
+        <w:jc w:val="both"/>
+      </w:pPr>
+      <w:r>
+        <w:rPr>
+          <w:rFonts w:ascii="Arial" w:hAnsi="Arial"/>
+          <w:sz w:val="24"/>
+        </w:rPr>
+        <w:t xml:space="preserve">• </w:t>
+      </w:r>
+      <w:r>
+        <w:rPr>
+          <w:rFonts w:ascii="Arial" w:hAnsi="Arial"/>
+          <w:sz w:val="24"/>
+        </w:rPr>
+        <w:t>Enfoque de Inversión Teórica (Mercado): Al dividir la valoración total de la mano de obra de desarrollo ($48000.00 MXN) entre el beneficio económico mensual ($15500.00 MXN), se obtiene un periodo de recuperación de 3.09 meses, lo que equivale a aproximadamente 3 meses y 3 días de operación.</w:t>
+      </w:r>
+    </w:p>
+    <w:p>
+      <w:pPr>
+        <w:spacing w:line="360" w:lineRule="auto" w:before="0" w:after="80"/>
+        <w:ind w:left="576" w:hanging="288"/>
+        <w:jc w:val="both"/>
+      </w:pPr>
+      <w:r>
+        <w:rPr>
+          <w:rFonts w:ascii="Arial" w:hAnsi="Arial"/>
+          <w:sz w:val="24"/>
+        </w:rPr>
+        <w:t xml:space="preserve">• </w:t>
+      </w:r>
+      <w:r>
+        <w:rPr>
+          <w:rFonts w:ascii="Arial" w:hAnsi="Arial"/>
+          <w:sz w:val="24"/>
+        </w:rPr>
+        <w:t>Enfoque de Inversión Real (Flujo de Caja): Dado que el desembolso financiero real efectuado por la organización para el desarrollo de la aplicación web fue de $0.00 MXN, la amortización es inmediata (desde el primer día de uso). El beneficio neto mensual de $15500.00 MXN se consolida como ahorro directo para el área de motores desde el inicio del despliegue.</w:t>
       </w:r>
     </w:p>
     <w:p>
@@ -22438,7 +22355,7 @@
           <w:rFonts w:ascii="Arial" w:hAnsi="Arial"/>
           <w:sz w:val="24"/>
         </w:rPr>
-        <w:t>En tercer lugar, se detallan los costos recurrentes de mantenimiento operativo para garantizar la estabilidad del sistema a largo plazo. Estos gastos fijos mensuales se resumen en la Tabla 7.</w:t>
+        <w:t>En tercer lugar, se evalúan los costos recurrentes de mantenimiento mensual para asegurar la viabilidad operativa a largo plazo. Estos se resumen en la Tabla 7.</w:t>
       </w:r>
     </w:p>
     <w:p>
@@ -22538,7 +22455,7 @@
                 <w:b/>
                 <w:sz w:val="20"/>
               </w:rPr>
-              <w:t>Costo mensual (USD)</w:t>
+              <w:t>Costo mensual (MXN)</w:t>
             </w:r>
           </w:p>
         </w:tc>
@@ -22594,7 +22511,7 @@
                 <w:rFonts w:ascii="Arial" w:hAnsi="Arial"/>
                 <w:sz w:val="20"/>
               </w:rPr>
-              <w:t>Infraestructura y almacenamiento de evidencias</w:t>
+              <w:t>Capa gratuita de Supabase y Vercel</w:t>
             </w:r>
           </w:p>
         </w:tc>
@@ -22612,7 +22529,7 @@
                 <w:rFonts w:ascii="Arial" w:hAnsi="Arial"/>
                 <w:sz w:val="20"/>
               </w:rPr>
-              <w:t>25.00</w:t>
+              <w:t>0.00</w:t>
             </w:r>
           </w:p>
         </w:tc>
@@ -22668,7 +22585,7 @@
                 <w:rFonts w:ascii="Arial" w:hAnsi="Arial"/>
                 <w:sz w:val="20"/>
               </w:rPr>
-              <w:t>Resolución de incidencias y actualizaciones (2 horas)</w:t>
+              <w:t>Soporte interno de tecnologías de información (2 horas estimadas a $400.00 MXN por hora)</w:t>
             </w:r>
           </w:p>
         </w:tc>
@@ -22686,155 +22603,7 @@
                 <w:rFonts w:ascii="Arial" w:hAnsi="Arial"/>
                 <w:sz w:val="20"/>
               </w:rPr>
-              <w:t>40.00</w:t>
-            </w:r>
-          </w:p>
-        </w:tc>
-      </w:tr>
-      <w:tr>
-        <w:tc>
-          <w:tcPr>
-            <w:tcW w:type="dxa" w:w="2880"/>
-          </w:tcPr>
-          <w:p>
-            <w:pPr>
-              <w:spacing w:before="60" w:after="60"/>
-              <w:jc w:val="left"/>
-            </w:pPr>
-            <w:r>
-              <w:rPr>
-                <w:rFonts w:ascii="Arial" w:hAnsi="Arial"/>
-                <w:sz w:val="20"/>
-              </w:rPr>
-              <w:t>Fondo de reposición de hardware</w:t>
-            </w:r>
-          </w:p>
-        </w:tc>
-        <w:tc>
-          <w:tcPr>
-            <w:tcW w:type="dxa" w:w="1440"/>
-          </w:tcPr>
-          <w:p>
-            <w:pPr>
-              <w:spacing w:before="60" w:after="60"/>
-              <w:jc w:val="left"/>
-            </w:pPr>
-            <w:r>
-              <w:rPr>
-                <w:rFonts w:ascii="Arial" w:hAnsi="Arial"/>
-                <w:sz w:val="20"/>
-              </w:rPr>
-              <w:t>Reserva</w:t>
-            </w:r>
-          </w:p>
-        </w:tc>
-        <w:tc>
-          <w:tcPr>
-            <w:tcW w:type="dxa" w:w="4608"/>
-          </w:tcPr>
-          <w:p>
-            <w:pPr>
-              <w:spacing w:before="60" w:after="60"/>
-              <w:jc w:val="left"/>
-            </w:pPr>
-            <w:r>
-              <w:rPr>
-                <w:rFonts w:ascii="Arial" w:hAnsi="Arial"/>
-                <w:sz w:val="20"/>
-              </w:rPr>
-              <w:t>Amortización para recambio de terminales móviles</w:t>
-            </w:r>
-          </w:p>
-        </w:tc>
-        <w:tc>
-          <w:tcPr>
-            <w:tcW w:type="dxa" w:w="1440"/>
-          </w:tcPr>
-          <w:p>
-            <w:pPr>
-              <w:spacing w:before="60" w:after="60"/>
-              <w:jc w:val="left"/>
-            </w:pPr>
-            <w:r>
-              <w:rPr>
-                <w:rFonts w:ascii="Arial" w:hAnsi="Arial"/>
-                <w:sz w:val="20"/>
-              </w:rPr>
-              <w:t>15.00</w:t>
-            </w:r>
-          </w:p>
-        </w:tc>
-      </w:tr>
-      <w:tr>
-        <w:tc>
-          <w:tcPr>
-            <w:tcW w:type="dxa" w:w="2880"/>
-          </w:tcPr>
-          <w:p>
-            <w:pPr>
-              <w:spacing w:before="60" w:after="60"/>
-              <w:jc w:val="left"/>
-            </w:pPr>
-            <w:r>
-              <w:rPr>
-                <w:rFonts w:ascii="Arial" w:hAnsi="Arial"/>
-                <w:sz w:val="20"/>
-              </w:rPr>
-              <w:t>Costo total de mantenimiento</w:t>
-            </w:r>
-          </w:p>
-        </w:tc>
-        <w:tc>
-          <w:tcPr>
-            <w:tcW w:type="dxa" w:w="1440"/>
-          </w:tcPr>
-          <w:p>
-            <w:pPr>
-              <w:spacing w:before="60" w:after="60"/>
-              <w:jc w:val="left"/>
-            </w:pPr>
-            <w:r>
-              <w:rPr>
-                <w:rFonts w:ascii="Arial" w:hAnsi="Arial"/>
-                <w:sz w:val="20"/>
-              </w:rPr>
-              <w:t>Operación</w:t>
-            </w:r>
-          </w:p>
-        </w:tc>
-        <w:tc>
-          <w:tcPr>
-            <w:tcW w:type="dxa" w:w="4608"/>
-          </w:tcPr>
-          <w:p>
-            <w:pPr>
-              <w:spacing w:before="60" w:after="60"/>
-              <w:jc w:val="left"/>
-            </w:pPr>
-            <w:r>
-              <w:rPr>
-                <w:rFonts w:ascii="Arial" w:hAnsi="Arial"/>
-                <w:sz w:val="20"/>
-              </w:rPr>
-              <w:t>Gasto recurrente mensual de ServiControl</w:t>
-            </w:r>
-          </w:p>
-        </w:tc>
-        <w:tc>
-          <w:tcPr>
-            <w:tcW w:type="dxa" w:w="1440"/>
-          </w:tcPr>
-          <w:p>
-            <w:pPr>
-              <w:spacing w:before="60" w:after="60"/>
-              <w:jc w:val="left"/>
-            </w:pPr>
-            <w:r>
-              <w:rPr>
-                <w:rFonts w:ascii="Arial" w:hAnsi="Arial"/>
-                <w:sz w:val="20"/>
-              </w:rPr>
-              <w:t>80.00</w:t>
+              <w:t>800.00</w:t>
             </w:r>
           </w:p>
         </w:tc>
@@ -23519,15 +23288,7 @@
         <w:pStyle w:val="Textocomentario"/>
       </w:pPr>
       <w:r>
-        <w:t xml:space="preserve">El resumen ya se puede ir avanzando, dejando pendiente la parte de conclusiones porque </w:t>
-      </w:r>
-      <w:proofErr w:type="spellStart"/>
-      <w:r>
-        <w:t>aun</w:t>
-      </w:r>
-      <w:proofErr w:type="spellEnd"/>
-      <w:r>
-        <w:t xml:space="preserve"> no se termina el proyecto.</w:t>
+        <w:t>El resumen ya se puede ir avanzando, dejando pendiente la parte de conclusiones porque aun no se termina el proyecto.</w:t>
       </w:r>
     </w:p>
   </w:comment>
@@ -23628,13 +23389,8 @@
       <w:r>
         <w:t xml:space="preserve">Hay que explicarla antes de incluirla. En el cuerpo del texto explicas </w:t>
       </w:r>
-      <w:proofErr w:type="spellStart"/>
-      <w:r>
-        <w:t>como</w:t>
-      </w:r>
-      <w:proofErr w:type="spellEnd"/>
-      <w:r>
-        <w:t xml:space="preserve"> funciona esto, en la figura 1 se muestra un esquema de la arquitectura cliente-servidor.</w:t>
+      <w:r>
+        <w:t>como funciona esto, en la figura 1 se muestra un esquema de la arquitectura cliente-servidor.</w:t>
       </w:r>
     </w:p>
   </w:comment>
@@ -23786,13 +23542,8 @@
       <w:pPr>
         <w:pStyle w:val="Textocomentario"/>
       </w:pPr>
-      <w:proofErr w:type="gramStart"/>
-      <w:r>
-        <w:t>Mas adelante te anote algunos puntos de ejemplo donde para detallar yo hago la pregunta “Como?</w:t>
-      </w:r>
-      <w:proofErr w:type="gramEnd"/>
-      <w:r>
-        <w:t>"</w:t>
+      <w:r>
+        <w:t>Mas adelante te anote algunos puntos de ejemplo donde para detallar yo hago la pregunta “Como?"</w:t>
       </w:r>
     </w:p>
     <w:p>
@@ -27012,6 +26763,15 @@
 </file>
 
 <file path=customXml/item1.xml><?xml version="1.0" encoding="utf-8"?>
+<?mso-contentType ?>
+<FormTemplates xmlns="http://schemas.microsoft.com/sharepoint/v3/contenttype/forms">
+  <Display>DocumentLibraryForm</Display>
+  <Edit>DocumentLibraryForm</Edit>
+  <New>DocumentLibraryForm</New>
+</FormTemplates>
+</file>
+
+<file path=customXml/item2.xml><?xml version="1.0" encoding="utf-8"?>
 <ct:contentTypeSchema xmlns:ct="http://schemas.microsoft.com/office/2006/metadata/contentType" xmlns:ma="http://schemas.microsoft.com/office/2006/metadata/properties/metaAttributes" ct:_="" ma:_="" ma:contentTypeName="Document" ma:contentTypeID="0x010100DB44A644FFB3D645B67AA77947D95E57" ma:contentTypeVersion="3" ma:contentTypeDescription="Create a new document." ma:contentTypeScope="" ma:versionID="824f9e65a32e55e3c61aa95e98d27f96">
   <xsd:schema xmlns:xsd="http://www.w3.org/2001/XMLSchema" xmlns:xs="http://www.w3.org/2001/XMLSchema" xmlns:p="http://schemas.microsoft.com/office/2006/metadata/properties" xmlns:ns2="c9a41bd4-3342-4308-8d8c-a81403e25f10" targetNamespace="http://schemas.microsoft.com/office/2006/metadata/properties" ma:root="true" ma:fieldsID="ff802a7858248f5f80ee5f80045f9534" ns2:_="">
     <xsd:import namespace="c9a41bd4-3342-4308-8d8c-a81403e25f10"/>
@@ -27149,26 +26909,25 @@
 </ct:contentTypeSchema>
 </file>
 
-<file path=customXml/item2.xml><?xml version="1.0" encoding="utf-8"?>
-<?mso-contentType ?>
-<FormTemplates xmlns="http://schemas.microsoft.com/sharepoint/v3/contenttype/forms">
-  <Display>DocumentLibraryForm</Display>
-  <Edit>DocumentLibraryForm</Edit>
-  <New>DocumentLibraryForm</New>
-</FormTemplates>
-</file>
-
 <file path=customXml/item3.xml><?xml version="1.0" encoding="utf-8"?>
-<b:Sources xmlns:b="http://schemas.openxmlformats.org/officeDocument/2006/bibliography" xmlns="http://schemas.openxmlformats.org/officeDocument/2006/bibliography" SelectedStyle="\APASixthEditionOfficeOnline.xsl" StyleName="APA" Version="6"/>
-</file>
-
-<file path=customXml/item4.xml><?xml version="1.0" encoding="utf-8"?>
 <p:properties xmlns:p="http://schemas.microsoft.com/office/2006/metadata/properties" xmlns:xsi="http://www.w3.org/2001/XMLSchema-instance" xmlns:pc="http://schemas.microsoft.com/office/infopath/2007/PartnerControls">
   <documentManagement/>
 </p:properties>
 </file>
 
+<file path=customXml/item4.xml><?xml version="1.0" encoding="utf-8"?>
+<b:Sources xmlns:b="http://schemas.openxmlformats.org/officeDocument/2006/bibliography" xmlns="http://schemas.openxmlformats.org/officeDocument/2006/bibliography" SelectedStyle="\APASixthEditionOfficeOnline.xsl" StyleName="APA" Version="6"/>
+</file>
+
 <file path=customXml/itemProps1.xml><?xml version="1.0" encoding="utf-8"?>
+<ds:datastoreItem xmlns:ds="http://schemas.openxmlformats.org/officeDocument/2006/customXml" ds:itemID="{046B7D6D-E179-42A3-9576-DF9EBF7715C1}">
+  <ds:schemaRefs>
+    <ds:schemaRef ds:uri="http://schemas.microsoft.com/sharepoint/v3/contenttype/forms"/>
+  </ds:schemaRefs>
+</ds:datastoreItem>
+</file>
+
+<file path=customXml/itemProps2.xml><?xml version="1.0" encoding="utf-8"?>
 <ds:datastoreItem xmlns:ds="http://schemas.openxmlformats.org/officeDocument/2006/customXml" ds:itemID="{73191520-D5FC-4CEE-B423-98D49CFE5F85}">
   <ds:schemaRefs>
     <ds:schemaRef ds:uri="http://schemas.microsoft.com/office/2006/metadata/contentType"/>
@@ -27186,27 +26945,19 @@
 </ds:datastoreItem>
 </file>
 
-<file path=customXml/itemProps2.xml><?xml version="1.0" encoding="utf-8"?>
-<ds:datastoreItem xmlns:ds="http://schemas.openxmlformats.org/officeDocument/2006/customXml" ds:itemID="{046B7D6D-E179-42A3-9576-DF9EBF7715C1}">
-  <ds:schemaRefs>
-    <ds:schemaRef ds:uri="http://schemas.microsoft.com/sharepoint/v3/contenttype/forms"/>
-  </ds:schemaRefs>
-</ds:datastoreItem>
-</file>
-
 <file path=customXml/itemProps3.xml><?xml version="1.0" encoding="utf-8"?>
-<ds:datastoreItem xmlns:ds="http://schemas.openxmlformats.org/officeDocument/2006/customXml" ds:itemID="{61C1B53D-B25B-4467-ABBC-0D26244BF9A8}">
-  <ds:schemaRefs>
-    <ds:schemaRef ds:uri="http://schemas.openxmlformats.org/officeDocument/2006/bibliography"/>
-  </ds:schemaRefs>
-</ds:datastoreItem>
-</file>
-
-<file path=customXml/itemProps4.xml><?xml version="1.0" encoding="utf-8"?>
 <ds:datastoreItem xmlns:ds="http://schemas.openxmlformats.org/officeDocument/2006/customXml" ds:itemID="{7504BB3C-81D6-44B0-887A-E6EEA91B0688}">
   <ds:schemaRefs>
     <ds:schemaRef ds:uri="http://schemas.microsoft.com/office/2006/metadata/properties"/>
     <ds:schemaRef ds:uri="http://schemas.microsoft.com/office/infopath/2007/PartnerControls"/>
   </ds:schemaRefs>
 </ds:datastoreItem>
+</file>
+
+<file path=customXml/itemProps4.xml><?xml version="1.0" encoding="utf-8"?>
+<ds:datastoreItem xmlns:ds="http://schemas.openxmlformats.org/officeDocument/2006/customXml" ds:itemID="{61C1B53D-B25B-4467-ABBC-0D26244BF9A8}">
+  <ds:schemaRefs>
+    <ds:schemaRef ds:uri="http://schemas.openxmlformats.org/officeDocument/2006/bibliography"/>
+  </ds:schemaRefs>
+</ds:datastoreItem>
 </file>
</xml_diff>

<commit_message>
docs: reformulate Chapter 4.4 and Table 7 based on user's manual edits to Section 4.2
</commit_message>
<xml_diff>
--- a/ESTADIAS 75% AVANCE V2..docx
+++ b/ESTADIAS 75% AVANCE V2..docx
@@ -21192,6 +21192,36 @@
     </w:p>
     <w:p>
       <w:pPr>
+        <w:pStyle w:val="CONTENIDO"/>
+      </w:pPr>
+    </w:p>
+    <w:p>
+      <w:pPr>
+        <w:pStyle w:val="CONTENIDO"/>
+      </w:pPr>
+    </w:p>
+    <w:p>
+      <w:pPr>
+        <w:pStyle w:val="CONTENIDO"/>
+      </w:pPr>
+    </w:p>
+    <w:p>
+      <w:pPr>
+        <w:pStyle w:val="CONTENIDO"/>
+      </w:pPr>
+    </w:p>
+    <w:p>
+      <w:pPr>
+        <w:pStyle w:val="CONTENIDO"/>
+      </w:pPr>
+    </w:p>
+    <w:p>
+      <w:pPr>
+        <w:pStyle w:val="CONTENIDO"/>
+      </w:pPr>
+    </w:p>
+    <w:p>
+      <w:pPr>
         <w:keepNext/>
         <w:spacing w:before="360" w:after="240"/>
         <w:jc w:val="left"/>
@@ -21207,16 +21237,43 @@
     </w:p>
     <w:p>
       <w:pPr>
-        <w:spacing w:line="360" w:lineRule="auto" w:before="0" w:after="120"/>
-        <w:ind w:left="0" w:firstLine="0"/>
-        <w:jc w:val="both"/>
+        <w:spacing w:after="120"/>
       </w:pPr>
       <w:r>
         <w:rPr>
           <w:rFonts w:ascii="Arial" w:hAnsi="Arial"/>
-          <w:sz w:val="24"/>
-        </w:rPr>
-        <w:t>En el presente capítulo se expone el análisis detallado de los resultados obtenidos tras la implementación y estabilización de la Aplicación Web Progresiva (PWA) ServiControl en el área de motores. La evaluación comprende las problemáticas técnicas resueltas durante la fase de despliegue, el desglose de los costos de inversión y mantenimiento, la medición cuantitativa de los beneficios operativos en comparación con el escenario manual previo, y el cálculo del tiempo estimado para la recuperación de la inversión financiera.</w:t>
+        </w:rPr>
+        <w:t>En el presente capítulo se expone el análisis detallado de los resultados obtenidos tr</w:t>
+      </w:r>
+      <w:r>
+        <w:rPr>
+          <w:rFonts w:ascii="Arial" w:hAnsi="Arial"/>
+        </w:rPr>
+        <w:t xml:space="preserve">as la implementación y estabilización de la Aplicación Web Progresiva (PWA) </w:t>
+      </w:r>
+      <w:r>
+        <w:rPr>
+          <w:rFonts w:ascii="Arial" w:hAnsi="Arial"/>
+        </w:rPr>
+        <w:t>para la gestión de órdenes de servicio</w:t>
+      </w:r>
+      <w:r>
+        <w:rPr>
+          <w:rFonts w:ascii="Arial" w:hAnsi="Arial"/>
+        </w:rPr>
+        <w:t xml:space="preserve">. La evaluación comprende las problemáticas técnicas </w:t>
+      </w:r>
+      <w:r>
+        <w:rPr>
+          <w:rFonts w:ascii="Arial" w:hAnsi="Arial"/>
+        </w:rPr>
+        <w:t>durante la fase de despliegue, el desglose de los costos de inversión y mantenimien</w:t>
+      </w:r>
+      <w:r>
+        <w:rPr>
+          <w:rFonts w:ascii="Arial" w:hAnsi="Arial"/>
+        </w:rPr>
+        <w:t>to, la medición cuantitativa de los beneficios operativos en comparación con el escenario manual previo, y el cálculo del tiempo estimado para la recuperación de la inversión financiera.</w:t>
       </w:r>
     </w:p>
     <w:p>
@@ -21236,73 +21293,228 @@
     </w:p>
     <w:p>
       <w:pPr>
-        <w:spacing w:line="360" w:lineRule="auto" w:before="0" w:after="120"/>
-        <w:ind w:left="0" w:firstLine="0"/>
-        <w:jc w:val="both"/>
+        <w:spacing w:after="120"/>
       </w:pPr>
       <w:r>
         <w:rPr>
           <w:rFonts w:ascii="Arial" w:hAnsi="Arial"/>
-          <w:sz w:val="24"/>
-        </w:rPr>
-        <w:t>Durante la transición del entorno de desarrollo local hacia el servidor de producción en la nube se identifican diversas incidencias que comprometen la usabilidad y consistencia del sistema en dispositivos móviles. A continuación, se describen los sucesos técnicos y las soluciones de software aplicadas para solventar cada problemática.</w:t>
-      </w:r>
-    </w:p>
-    <w:p>
-      <w:pPr>
-        <w:spacing w:line="360" w:lineRule="auto" w:before="0" w:after="120"/>
-        <w:ind w:left="0" w:firstLine="0"/>
-        <w:jc w:val="both"/>
-      </w:pPr>
+        </w:rPr>
+        <w:t>Durante la t</w:t>
+      </w:r>
       <w:r>
         <w:rPr>
           <w:rFonts w:ascii="Arial" w:hAnsi="Arial"/>
-          <w:sz w:val="24"/>
-        </w:rPr>
-        <w:t>En primer lugar, se detecta que las imágenes de evidencia fotográfica capturadas con cámaras de alta resolución en dispositivos inteligentes presentan un tamaño excesivo de entre cinco y diez megabytes (MB). Al intentar transferir estos archivos binarios mediante conexiones de datos móviles inestables (redes de tercera generación (3G) o cuarta generación (4G) débiles), las solicitudes al servicio de almacenamiento de Supabase Storage experimentan retrasos y cancelaciones por agotamiento del tiempo de espera de red (timeout). Para mitigar este inconveniente, se integra una rutina de compresión de imágenes en el cliente que se ejecuta de forma síncrona en el componente de detalle de la orden. Mediante un lienzo (Canvas) del lenguaje de maquetado de hipertexto (HTML5), la imagen original se redimensiona a un límite de 1280 píxeles y se recomprime a formato Joint Photographic Experts Group (JPEG) con una calidad del 75%, reduciendo el peso promedio del archivo a menos de 240 kilobytes (KB) y garantizando la subida en menos de dos segundos.</w:t>
-      </w:r>
-    </w:p>
-    <w:p>
-      <w:pPr>
-        <w:spacing w:line="360" w:lineRule="auto" w:before="0" w:after="120"/>
-        <w:ind w:left="0" w:firstLine="0"/>
-        <w:jc w:val="both"/>
-      </w:pPr>
+        </w:rPr>
+        <w:t>ransición del entorno de desarrollo local hacia el servidor de producción en la nube se identifican diversas incidencias que comprometen la usabilidad y consistencia del sistema en dispositivos móviles. A continuación, se describen los sucesos técnicos y l</w:t>
+      </w:r>
       <w:r>
         <w:rPr>
           <w:rFonts w:ascii="Arial" w:hAnsi="Arial"/>
-          <w:sz w:val="24"/>
-        </w:rPr>
-        <w:t>En segundo lugar, la captura de la geolocalización de inicio y cierre de los servicios presenta vulnerabilidades asociadas a la señal del Sistema de Posicionamiento Global (GPS) y la gestión de permisos del navegador. Si el operario bloquea el acceso al sensor o si la recepción satelital se interrumpe en interiores, la aplicación se detiene silenciosamente. Para resolver esta situación, se introduce una rutina asíncrona de geolocalización que opera en cascada de dos niveles. El primer nivel intenta obtener las coordenadas con alta precisión; si la consulta supera un tiempo límite de diez segundos o falla, la excepción es capturada y el sistema inicia automáticamente un segundo nivel con baja precisión, triangulando la ubicación a través de celdas móviles y redes inalámbricas (WiFi). Además, si ambos niveles fallan por completo, se despliega un panel emergente interactivo que provee al técnico instrucciones paso a paso para reactivar el sensor o ajustar los permisos.</w:t>
-      </w:r>
-    </w:p>
-    <w:p>
-      <w:pPr>
-        <w:spacing w:line="360" w:lineRule="auto" w:before="0" w:after="120"/>
-        <w:ind w:left="0" w:firstLine="0"/>
-        <w:jc w:val="both"/>
-      </w:pPr>
-      <w:r>
+        </w:rPr>
+        <w:t>as soluciones de software aplicadas para solventar cada problemática.</w:t>
+      </w:r>
+    </w:p>
+    <w:p>
+      <w:pPr>
+        <w:spacing w:after="120"/>
         <w:rPr>
           <w:rFonts w:ascii="Arial" w:hAnsi="Arial"/>
-          <w:sz w:val="24"/>
-        </w:rPr>
-        <w:t>En tercer lugar, se identifica un fallo de consistencia en el registro de ubicaciones provocado por una discrepancia en el esquema de base de datos de la plataforma Supabase. Las peticiones de inserción y actualización retornan un código de error de protocolo de transferencia de hipertexto (HTTP) 400 debido a que la tabla pública de ubicaciones carece de la columna para almacenar la dirección postal en formato de texto. Dado que el servicio de geocodificación inversa se ejecuta de forma dinámica del lado del cliente, se decide remover la columna de dirección del payload de inserción de base de datos. De este modo, la aplicación persiste únicamente los datos numéricos de latitud y longitud, y delega la traducción a direcciones legibles a la biblioteca del frontend, la cual consulta el servidor de Nominatim en tiempo real al abrir el expediente.</w:t>
-      </w:r>
-    </w:p>
-    <w:p>
-      <w:pPr>
-        <w:spacing w:line="360" w:lineRule="auto" w:before="0" w:after="120"/>
-        <w:ind w:left="0" w:firstLine="0"/>
-        <w:jc w:val="both"/>
+        </w:rPr>
       </w:pPr>
       <w:r>
         <w:rPr>
           <w:rFonts w:ascii="Arial" w:hAnsi="Arial"/>
-          <w:sz w:val="24"/>
-        </w:rPr>
-        <w:t>En cuarto lugar, durante las pruebas sin conexión a internet, se comprueba que el Service Worker recupera con éxito la interfaz estática, pero la comunicación dinámica con la base de datos aborta con el error crudo TypeError: Failed to fetch. Para corregir este comportamiento, se adiciona un mecanismo de caché persistente que almacena las órdenes de servicio en la memoria del navegador (localStorage) durante los periodos de conexión activa. Al detectarse el estado offline, el dashboard del técnico captura la excepción, recupera la lista de órdenes locales y reemplaza el mensaje de error por un banner de color ámbar que detalla la operación en modo sin conexión.</w:t>
-      </w:r>
+        </w:rPr>
+        <w:t>En primer lugar, se detecta que las imágenes de evidencia fotográfica capturadas con cámaras de alta resolución en dispositivos inteligentes presentan un tamaño excesivo de entre cinco y</w:t>
+      </w:r>
+      <w:r>
+        <w:rPr>
+          <w:rFonts w:ascii="Arial" w:hAnsi="Arial"/>
+        </w:rPr>
+        <w:t xml:space="preserve"> diez megabytes (MB). Al intentar transferir estos archivos binarios mediante conexiones de datos móviles inestables (redes de tercera generación (3G) o cuarta generación (4G) débiles), las solicitudes al servicio de almacenamiento de Supabase Storage expe</w:t>
+      </w:r>
+      <w:r>
+        <w:rPr>
+          <w:rFonts w:ascii="Arial" w:hAnsi="Arial"/>
+        </w:rPr>
+        <w:t xml:space="preserve">rimentan retrasos y cancelaciones por agotamiento del tiempo de espera de red (timeout). Para mitigar este inconveniente, se integra una rutina de compresión de imágenes en </w:t>
+      </w:r>
+      <w:r>
+        <w:rPr>
+          <w:rFonts w:ascii="Arial" w:hAnsi="Arial"/>
+        </w:rPr>
+        <w:lastRenderedPageBreak/>
+        <w:t>el cliente que se ejecuta de forma síncrona en el componente de detalle de la orden</w:t>
+      </w:r>
+      <w:r>
+        <w:rPr>
+          <w:rFonts w:ascii="Arial" w:hAnsi="Arial"/>
+        </w:rPr>
+        <w:t xml:space="preserve">. Mediante un lienzo (Canvas) del lenguaje de maquetado de hipertexto (HTML5), la imagen original se redimensiona a un límite de 1280 píxeles y se </w:t>
+      </w:r>
+      <w:proofErr w:type="spellStart"/>
+      <w:r>
+        <w:rPr>
+          <w:rFonts w:ascii="Arial" w:hAnsi="Arial"/>
+        </w:rPr>
+        <w:t>recomprime</w:t>
+      </w:r>
+      <w:proofErr w:type="spellEnd"/>
+      <w:r>
+        <w:rPr>
+          <w:rFonts w:ascii="Arial" w:hAnsi="Arial"/>
+        </w:rPr>
+        <w:t xml:space="preserve"> a formato </w:t>
+      </w:r>
+      <w:proofErr w:type="spellStart"/>
+      <w:r>
+        <w:rPr>
+          <w:rFonts w:ascii="Arial" w:hAnsi="Arial"/>
+        </w:rPr>
+        <w:t>jpeg</w:t>
+      </w:r>
+      <w:proofErr w:type="spellEnd"/>
+      <w:r>
+        <w:rPr>
+          <w:rFonts w:ascii="Arial" w:hAnsi="Arial"/>
+        </w:rPr>
+        <w:t xml:space="preserve"> con una calidad del 75%, reduciendo el peso prom</w:t>
+      </w:r>
+      <w:r>
+        <w:rPr>
+          <w:rFonts w:ascii="Arial" w:hAnsi="Arial"/>
+        </w:rPr>
+        <w:t>edio del archivo a menos de 240 kilobytes (KB) y garantizando la subida en menos de dos segundos.</w:t>
+      </w:r>
+    </w:p>
+    <w:p>
+      <w:pPr>
+        <w:spacing w:after="120"/>
+      </w:pPr>
+    </w:p>
+    <w:p>
+      <w:pPr>
+        <w:spacing w:after="120"/>
+        <w:rPr>
+          <w:rFonts w:ascii="Arial" w:hAnsi="Arial"/>
+        </w:rPr>
+      </w:pPr>
+      <w:r>
+        <w:rPr>
+          <w:rFonts w:ascii="Arial" w:hAnsi="Arial"/>
+        </w:rPr>
+        <w:t>En segundo lugar, la captura de la geolocalización de inicio y cierre de los servicios presenta vulnerabilidades asociadas a la señal del Sistema de Posiciona</w:t>
+      </w:r>
+      <w:r>
+        <w:rPr>
+          <w:rFonts w:ascii="Arial" w:hAnsi="Arial"/>
+        </w:rPr>
+        <w:t xml:space="preserve">miento Global (GPS) y la gestión de permisos del navegador. Si el operario bloquea el acceso al sensor o si la recepción satelital se interrumpe en interiores, la aplicación se detiene silenciosamente. Para resolver esta situación, se introduce una rutina </w:t>
+      </w:r>
+      <w:r>
+        <w:rPr>
+          <w:rFonts w:ascii="Arial" w:hAnsi="Arial"/>
+        </w:rPr>
+        <w:t>asíncrona de geolocalización que opera en cascada de dos niveles. El primer nivel intenta obtener las coordenadas con alta precisión; si la consulta supera un tiempo límite de diez segundos o falla, la excepción es capturada y el sistema inicia automáticam</w:t>
+      </w:r>
+      <w:r>
+        <w:rPr>
+          <w:rFonts w:ascii="Arial" w:hAnsi="Arial"/>
+        </w:rPr>
+        <w:t>ente un segundo nivel con baja precisión, triangulando la ubicación a través de celdas móviles y redes inalámbricas (WiFi). Además, si ambos niveles fallan por completo, se despliega un panel emergente interactivo que provee al técnico instrucciones paso a</w:t>
+      </w:r>
+      <w:r>
+        <w:rPr>
+          <w:rFonts w:ascii="Arial" w:hAnsi="Arial"/>
+        </w:rPr>
+        <w:t xml:space="preserve"> paso para reactivar el sensor o ajustar los permisos.</w:t>
+      </w:r>
+    </w:p>
+    <w:p>
+      <w:pPr>
+        <w:spacing w:after="120"/>
+      </w:pPr>
+    </w:p>
+    <w:p>
+      <w:pPr>
+        <w:spacing w:after="120"/>
+        <w:rPr>
+          <w:rFonts w:ascii="Arial" w:hAnsi="Arial"/>
+        </w:rPr>
+      </w:pPr>
+      <w:r>
+        <w:rPr>
+          <w:rFonts w:ascii="Arial" w:hAnsi="Arial"/>
+        </w:rPr>
+        <w:t>En tercer lugar, se identifica un fallo de consistencia en el registro de ubicaciones provocado por una discrepancia en el esquema de base de datos de la plataforma Supabase. Las peticiones de inserció</w:t>
+      </w:r>
+      <w:r>
+        <w:rPr>
+          <w:rFonts w:ascii="Arial" w:hAnsi="Arial"/>
+        </w:rPr>
+        <w:t>n y actualización retornan un código de error de protocolo de transferencia de hipertexto (HTTP) 400 debido a que la tabla pública de ubicaciones carece de la columna para almacenar la dirección postal en formato de texto. Dado que el servicio de geocodifi</w:t>
+      </w:r>
+      <w:r>
+        <w:rPr>
+          <w:rFonts w:ascii="Arial" w:hAnsi="Arial"/>
+        </w:rPr>
+        <w:t>cación inversa se ejecuta de forma dinámica del lado del cliente, se decide remover la columna de dirección del payload de inserción de base de datos. De este modo, la aplicación persiste únicamente los datos numéricos de latitud y longitud, y delega la tr</w:t>
+      </w:r>
+      <w:r>
+        <w:rPr>
+          <w:rFonts w:ascii="Arial" w:hAnsi="Arial"/>
+        </w:rPr>
+        <w:t xml:space="preserve">aducción a </w:t>
+      </w:r>
+      <w:r>
+        <w:rPr>
+          <w:rFonts w:ascii="Arial" w:hAnsi="Arial"/>
+        </w:rPr>
+        <w:lastRenderedPageBreak/>
+        <w:t>direcciones legibles a la biblioteca del frontend, la cual consulta el servidor de Nominatim en tiempo real al abrir el expediente.</w:t>
+      </w:r>
+    </w:p>
+    <w:p>
+      <w:pPr>
+        <w:spacing w:after="120"/>
+      </w:pPr>
+    </w:p>
+    <w:p>
+      <w:pPr>
+        <w:spacing w:after="120"/>
+        <w:rPr>
+          <w:rFonts w:ascii="Arial" w:hAnsi="Arial"/>
+        </w:rPr>
+      </w:pPr>
+      <w:r>
+        <w:rPr>
+          <w:rFonts w:ascii="Arial" w:hAnsi="Arial"/>
+        </w:rPr>
+        <w:t>En cuarto lugar, durante las pruebas sin conexión a internet, se comprueba que el Service Worker recupera con éxi</w:t>
+      </w:r>
+      <w:r>
+        <w:rPr>
+          <w:rFonts w:ascii="Arial" w:hAnsi="Arial"/>
+        </w:rPr>
+        <w:t>to la interfaz estática, pero la comunicación dinámica con la base de datos aborta con el error crudo TypeError: Failed to fetch. Para corregir este comportamiento, se adiciona un mecanismo de caché persistente que almacena las órdenes de servicio en la me</w:t>
+      </w:r>
+      <w:r>
+        <w:rPr>
+          <w:rFonts w:ascii="Arial" w:hAnsi="Arial"/>
+        </w:rPr>
+        <w:t>moria del navegador (localStorage) durante los periodos de conexión activa. Al detectarse el estado offline, el dashboard del técnico captura la excepción, recupera la lista de órdenes locales y reemplaza el mensaje de error por un banner de color ámbar qu</w:t>
+      </w:r>
+      <w:r>
+        <w:rPr>
+          <w:rFonts w:ascii="Arial" w:hAnsi="Arial"/>
+        </w:rPr>
+        <w:t>e detalla la operación en modo sin conexión.</w:t>
+      </w:r>
+    </w:p>
+    <w:p>
+      <w:pPr>
+        <w:spacing w:after="120"/>
+      </w:pPr>
     </w:p>
     <w:p>
       <w:pPr>
@@ -21321,60 +21533,139 @@
     </w:p>
     <w:p>
       <w:pPr>
-        <w:spacing w:line="360" w:lineRule="auto" w:before="0" w:after="120"/>
-        <w:ind w:left="0" w:firstLine="0"/>
-        <w:jc w:val="both"/>
+        <w:spacing w:after="120"/>
       </w:pPr>
       <w:r>
         <w:rPr>
           <w:rFonts w:ascii="Arial" w:hAnsi="Arial"/>
-          <w:sz w:val="24"/>
-        </w:rPr>
-        <w:t>La evaluación financiera de la solución tecnológica abarca únicamente aquellos conceptos directamente asociados con el diseño y la programación de la aplicación. De acuerdo con las pautas del análisis de viabilidad, se excluyen los recursos preexistentes de la organización que son utilizados en sus operaciones cotidianas (como el equipo de cómputo proporcionado por la empresa, el suministro eléctrico, la conexión a internet de la planta y los dispositivos móviles de los operarios).</w:t>
-      </w:r>
-    </w:p>
-    <w:p>
-      <w:pPr>
-        <w:spacing w:line="360" w:lineRule="auto" w:before="0" w:after="120"/>
-        <w:ind w:left="0" w:firstLine="0"/>
-        <w:jc w:val="both"/>
-      </w:pPr>
+        </w:rPr>
+        <w:t>La evaluación financiera de la solución tecnológica abarca únicamente aquellos conceptos directamente asociados con el diseño y la programación de la aplicación. De acuerdo con las pauta</w:t>
+      </w:r>
       <w:r>
         <w:rPr>
           <w:rFonts w:ascii="Arial" w:hAnsi="Arial"/>
-          <w:sz w:val="24"/>
-        </w:rPr>
-        <w:t>Asimismo, al tratarse de un proyecto de estadías académicas ejecutado bajo la modalidad de prácticas profesionales, la organización no realiza ningún desembolso real por concepto de sueldo o contratación externa. No obstante, para efectos del presupuesto analítico del proyecto y la valoración del software en el mercado, se integra una estimación basada en el salario mínimo promedio mensual que recibe un Desarrollador Junior (Jr) en México, el cual se establece en $12000.00 Pesos Mexicanos (MXN). En la Tabla 5 se resume el costo teórico de inversión del proyecto de mejora.</w:t>
-      </w:r>
-    </w:p>
-    <w:p>
-      <w:pPr>
-        <w:spacing w:before="240" w:after="80"/>
-      </w:pPr>
+        </w:rPr>
+        <w:t>s del análisis de viabilidad, se excluyen los recursos preexistentes de la organización que son utilizados en sus operaciones cotidianas (como el equipo de cómputo proporcionado por la empresa, el suministro eléctrico, la conexión a internet de la planta y</w:t>
+      </w:r>
       <w:r>
         <w:rPr>
           <w:rFonts w:ascii="Arial" w:hAnsi="Arial"/>
-          <w:sz w:val="20"/>
-        </w:rPr>
-        <w:t>Tabla 5. Costos directos asociados al desarrollo e infraestructura del proyecto</w:t>
-      </w:r>
+        </w:rPr>
+        <w:t xml:space="preserve"> los dispositivos móviles de los operarios).</w:t>
+      </w:r>
+    </w:p>
+    <w:p>
+      <w:pPr>
+        <w:spacing w:after="120"/>
+        <w:rPr>
+          <w:rFonts w:ascii="Arial" w:hAnsi="Arial"/>
+        </w:rPr>
+      </w:pPr>
+      <w:r>
+        <w:rPr>
+          <w:rFonts w:ascii="Arial" w:hAnsi="Arial"/>
+        </w:rPr>
+        <w:t xml:space="preserve">Asimismo, al tratarse de un proyecto de estadías académicas </w:t>
+      </w:r>
+      <w:r>
+        <w:rPr>
+          <w:rFonts w:ascii="Arial" w:hAnsi="Arial"/>
+        </w:rPr>
+        <w:t xml:space="preserve">bajo la modalidad de prácticas profesionales, la organización </w:t>
+      </w:r>
+      <w:r>
+        <w:rPr>
+          <w:rFonts w:ascii="Arial" w:hAnsi="Arial"/>
+        </w:rPr>
+        <w:t>no se encuentra obligada a realizar un</w:t>
+      </w:r>
+      <w:r>
+        <w:rPr>
+          <w:rFonts w:ascii="Arial" w:hAnsi="Arial"/>
+        </w:rPr>
+        <w:t xml:space="preserve"> desembolso real por concepto de sueldo o contratación externa</w:t>
+      </w:r>
+      <w:r>
+        <w:rPr>
+          <w:rFonts w:ascii="Arial" w:hAnsi="Arial"/>
+        </w:rPr>
+        <w:t>. No obstante, para efectos del presupuesto analítico del proyecto y la valoración del software en el mercado, se integra una estimación basada en el salario mínimo promedio mensual que recibe un Desarrollador Junior (Jr) en México, el cual se establece en</w:t>
+      </w:r>
+      <w:r>
+        <w:rPr>
+          <w:rFonts w:ascii="Arial" w:hAnsi="Arial"/>
+        </w:rPr>
+        <w:t xml:space="preserve"> $12000.00 Pesos Mexicanos (MXN).</w:t>
+      </w:r>
+      <w:r>
+        <w:rPr>
+          <w:rFonts w:ascii="Arial" w:hAnsi="Arial"/>
+        </w:rPr>
+        <w:t xml:space="preserve">Por otro lado, se calculan los costos mensuales de los servicios de base de datos </w:t>
+      </w:r>
+      <w:proofErr w:type="spellStart"/>
+      <w:r>
+        <w:rPr>
+          <w:rFonts w:ascii="Arial" w:hAnsi="Arial"/>
+        </w:rPr>
+        <w:t>Supabase</w:t>
+      </w:r>
+      <w:proofErr w:type="spellEnd"/>
+      <w:r>
+        <w:rPr>
+          <w:rFonts w:ascii="Arial" w:hAnsi="Arial"/>
+        </w:rPr>
+        <w:t xml:space="preserve"> y el alojamiento del sitio </w:t>
+      </w:r>
+      <w:r>
+        <w:rPr>
+          <w:rFonts w:ascii="Arial" w:hAnsi="Arial"/>
+        </w:rPr>
+        <w:lastRenderedPageBreak/>
+        <w:t xml:space="preserve">web mediante </w:t>
+      </w:r>
+      <w:proofErr w:type="spellStart"/>
+      <w:r>
+        <w:rPr>
+          <w:rFonts w:ascii="Arial" w:hAnsi="Arial"/>
+        </w:rPr>
+        <w:t>Vercel</w:t>
+      </w:r>
+      <w:proofErr w:type="spellEnd"/>
+      <w:r>
+        <w:rPr>
+          <w:rFonts w:ascii="Arial" w:hAnsi="Arial"/>
+        </w:rPr>
+        <w:t>, ambos servicios se encuentran dentro del plan pro, con costos mensuales de 500.00 MXN y 400.00 MXN respectivamente.</w:t>
+      </w:r>
+      <w:r>
+        <w:rPr>
+          <w:rFonts w:ascii="Arial" w:hAnsi="Arial"/>
+        </w:rPr>
+        <w:t xml:space="preserve"> En la Tabla 5 se resume el costo teórico de inversión del proyecto de mejora.</w:t>
+      </w:r>
+    </w:p>
+    <w:p>
+      <w:pPr>
+        <w:spacing w:after="120"/>
+      </w:pPr>
     </w:p>
     <w:tbl>
       <w:tblPr>
         <w:tblStyle w:val="Tablaconcuadrcula"/>
-        <w:tblW w:type="auto" w:w="0"/>
-        <w:tblLook w:firstColumn="1" w:firstRow="1" w:lastColumn="0" w:lastRow="0" w:noHBand="0" w:noVBand="1" w:val="04A0"/>
+        <w:tblW w:w="0" w:type="auto"/>
+        <w:tblLook w:val="04A0" w:firstRow="1" w:lastRow="0" w:firstColumn="1" w:lastColumn="0" w:noHBand="0" w:noVBand="1"/>
       </w:tblPr>
       <w:tblGrid>
-        <w:gridCol w:w="2138"/>
-        <w:gridCol w:w="2138"/>
-        <w:gridCol w:w="2138"/>
-        <w:gridCol w:w="2138"/>
+        <w:gridCol w:w="2210"/>
+        <w:gridCol w:w="1540"/>
+        <w:gridCol w:w="3491"/>
+        <w:gridCol w:w="1303"/>
       </w:tblGrid>
       <w:tr>
         <w:tc>
           <w:tcPr>
-            <w:tcW w:type="dxa" w:w="2592"/>
+            <w:tcW w:w="2210" w:type="dxa"/>
           </w:tcPr>
           <w:p>
             <w:pPr>
@@ -21393,7 +21684,7 @@
         </w:tc>
         <w:tc>
           <w:tcPr>
-            <w:tcW w:type="dxa" w:w="1728"/>
+            <w:tcW w:w="1540" w:type="dxa"/>
           </w:tcPr>
           <w:p>
             <w:pPr>
@@ -21412,7 +21703,7 @@
         </w:tc>
         <w:tc>
           <w:tcPr>
-            <w:tcW w:type="dxa" w:w="4608"/>
+            <w:tcW w:w="3491" w:type="dxa"/>
           </w:tcPr>
           <w:p>
             <w:pPr>
@@ -21431,7 +21722,7 @@
         </w:tc>
         <w:tc>
           <w:tcPr>
-            <w:tcW w:type="dxa" w:w="1440"/>
+            <w:tcW w:w="1303" w:type="dxa"/>
           </w:tcPr>
           <w:p>
             <w:pPr>
@@ -21452,7 +21743,7 @@
       <w:tr>
         <w:tc>
           <w:tcPr>
-            <w:tcW w:type="dxa" w:w="2592"/>
+            <w:tcW w:w="2210" w:type="dxa"/>
           </w:tcPr>
           <w:p>
             <w:pPr>
@@ -21464,13 +21755,20 @@
                 <w:rFonts w:ascii="Arial" w:hAnsi="Arial"/>
                 <w:sz w:val="20"/>
               </w:rPr>
-              <w:t>Mano de obra de desarrollo</w:t>
+              <w:t xml:space="preserve">Mano de </w:t>
+            </w:r>
+            <w:r>
+              <w:rPr>
+                <w:rFonts w:ascii="Arial" w:hAnsi="Arial"/>
+                <w:sz w:val="20"/>
+              </w:rPr>
+              <w:t>obra de desarrollo</w:t>
             </w:r>
           </w:p>
         </w:tc>
         <w:tc>
           <w:tcPr>
-            <w:tcW w:type="dxa" w:w="1728"/>
+            <w:tcW w:w="1540" w:type="dxa"/>
           </w:tcPr>
           <w:p>
             <w:pPr>
@@ -21488,7 +21786,7 @@
         </w:tc>
         <w:tc>
           <w:tcPr>
-            <w:tcW w:type="dxa" w:w="4608"/>
+            <w:tcW w:w="3491" w:type="dxa"/>
           </w:tcPr>
           <w:p>
             <w:pPr>
@@ -21500,13 +21798,20 @@
                 <w:rFonts w:ascii="Arial" w:hAnsi="Arial"/>
                 <w:sz w:val="20"/>
               </w:rPr>
-              <w:t>Honorarios de programación basados en el salario mensual de un Desarrollador Jr en México ($12000.00 MXN mensuales por 4 meses)</w:t>
+              <w:t xml:space="preserve">Honorarios de programación basados en el salario mensual de un Desarrollador Jr en México ($12000.00 MXN </w:t>
+            </w:r>
+            <w:r>
+              <w:rPr>
+                <w:rFonts w:ascii="Arial" w:hAnsi="Arial"/>
+                <w:sz w:val="20"/>
+              </w:rPr>
+              <w:t>mensuales, tiempo de desarrollo de 1 mes)</w:t>
             </w:r>
           </w:p>
         </w:tc>
         <w:tc>
           <w:tcPr>
-            <w:tcW w:type="dxa" w:w="1440"/>
+            <w:tcW w:w="1303" w:type="dxa"/>
           </w:tcPr>
           <w:p>
             <w:pPr>
@@ -21518,7 +21823,14 @@
                 <w:rFonts w:ascii="Arial" w:hAnsi="Arial"/>
                 <w:sz w:val="20"/>
               </w:rPr>
-              <w:t>48000.00</w:t>
+              <w:t>12000</w:t>
+            </w:r>
+            <w:r>
+              <w:rPr>
+                <w:rFonts w:ascii="Arial" w:hAnsi="Arial"/>
+                <w:sz w:val="20"/>
+              </w:rPr>
+              <w:t>.00</w:t>
             </w:r>
           </w:p>
         </w:tc>
@@ -21526,7 +21838,7 @@
       <w:tr>
         <w:tc>
           <w:tcPr>
-            <w:tcW w:type="dxa" w:w="2592"/>
+            <w:tcW w:w="2210" w:type="dxa"/>
           </w:tcPr>
           <w:p>
             <w:pPr>
@@ -21544,7 +21856,7 @@
         </w:tc>
         <w:tc>
           <w:tcPr>
-            <w:tcW w:type="dxa" w:w="1728"/>
+            <w:tcW w:w="1540" w:type="dxa"/>
           </w:tcPr>
           <w:p>
             <w:pPr>
@@ -21562,7 +21874,7 @@
         </w:tc>
         <w:tc>
           <w:tcPr>
-            <w:tcW w:type="dxa" w:w="4608"/>
+            <w:tcW w:w="3491" w:type="dxa"/>
           </w:tcPr>
           <w:p>
             <w:pPr>
@@ -21574,13 +21886,57 @@
                 <w:rFonts w:ascii="Arial" w:hAnsi="Arial"/>
                 <w:sz w:val="20"/>
               </w:rPr>
-              <w:t>Servidores y base de datos relacional (Plan gratuito de Supabase y Vercel)</w:t>
+              <w:t>Servidores y base de datos relacion</w:t>
+            </w:r>
+            <w:r>
+              <w:rPr>
+                <w:rFonts w:ascii="Arial" w:hAnsi="Arial"/>
+                <w:sz w:val="20"/>
+              </w:rPr>
+              <w:t xml:space="preserve">al (Plan </w:t>
+            </w:r>
+            <w:r>
+              <w:rPr>
+                <w:rFonts w:ascii="Arial" w:hAnsi="Arial"/>
+                <w:sz w:val="20"/>
+              </w:rPr>
+              <w:t>pro</w:t>
+            </w:r>
+            <w:r>
+              <w:rPr>
+                <w:rFonts w:ascii="Arial" w:hAnsi="Arial"/>
+                <w:sz w:val="20"/>
+              </w:rPr>
+              <w:t xml:space="preserve"> de Supabase y </w:t>
+            </w:r>
+            <w:proofErr w:type="spellStart"/>
+            <w:r>
+              <w:rPr>
+                <w:rFonts w:ascii="Arial" w:hAnsi="Arial"/>
+                <w:sz w:val="20"/>
+              </w:rPr>
+              <w:t>Vercel</w:t>
+            </w:r>
+            <w:proofErr w:type="spellEnd"/>
+            <w:r>
+              <w:rPr>
+                <w:rFonts w:ascii="Arial" w:hAnsi="Arial"/>
+                <w:sz w:val="20"/>
+              </w:rPr>
+              <w:t>)</w:t>
+            </w:r>
+            <w:r>
+              <w:rPr>
+                <w:rFonts w:ascii="Arial" w:hAnsi="Arial"/>
+                <w:sz w:val="20"/>
+              </w:rPr>
+              <w:t xml:space="preserve"> (Costo mensual)</w:t>
             </w:r>
           </w:p>
         </w:tc>
         <w:tc>
           <w:tcPr>
-            <w:tcW w:type="dxa" w:w="1440"/>
+            <w:tcW w:w="1303" w:type="dxa"/>
           </w:tcPr>
           <w:p>
             <w:pPr>
@@ -21592,7 +21948,7 @@
                 <w:rFonts w:ascii="Arial" w:hAnsi="Arial"/>
                 <w:sz w:val="20"/>
               </w:rPr>
-              <w:t>0.00</w:t>
+              <w:t>900.00</w:t>
             </w:r>
           </w:p>
         </w:tc>
@@ -21600,25 +21956,41 @@
       <w:tr>
         <w:tc>
           <w:tcPr>
-            <w:tcW w:type="dxa" w:w="2592"/>
+            <w:tcW w:w="2210" w:type="dxa"/>
           </w:tcPr>
           <w:p>
             <w:pPr>
               <w:spacing w:before="60" w:after="60"/>
               <w:jc w:val="left"/>
             </w:pPr>
+            <w:proofErr w:type="gramStart"/>
             <w:r>
               <w:rPr>
                 <w:rFonts w:ascii="Arial" w:hAnsi="Arial"/>
                 <w:sz w:val="20"/>
               </w:rPr>
-              <w:t>Dispositivos y conectividad</w:t>
+              <w:t>Total</w:t>
+            </w:r>
+            <w:proofErr w:type="gramEnd"/>
+            <w:r>
+              <w:rPr>
+                <w:rFonts w:ascii="Arial" w:hAnsi="Arial"/>
+                <w:sz w:val="20"/>
+              </w:rPr>
+              <w:t xml:space="preserve"> d</w:t>
+            </w:r>
+            <w:r>
+              <w:rPr>
+                <w:rFonts w:ascii="Arial" w:hAnsi="Arial"/>
+                <w:sz w:val="20"/>
+              </w:rPr>
+              <w:t>e la inversión</w:t>
             </w:r>
           </w:p>
         </w:tc>
         <w:tc>
           <w:tcPr>
-            <w:tcW w:type="dxa" w:w="1728"/>
+            <w:tcW w:w="1540" w:type="dxa"/>
           </w:tcPr>
           <w:p>
             <w:pPr>
@@ -21630,13 +22002,13 @@
                 <w:rFonts w:ascii="Arial" w:hAnsi="Arial"/>
                 <w:sz w:val="20"/>
               </w:rPr>
-              <w:t>Hardware / Red</w:t>
+              <w:t>Finanzas</w:t>
             </w:r>
           </w:p>
         </w:tc>
         <w:tc>
           <w:tcPr>
-            <w:tcW w:type="dxa" w:w="4608"/>
+            <w:tcW w:w="3491" w:type="dxa"/>
           </w:tcPr>
           <w:p>
             <w:pPr>
@@ -21648,13 +22020,284 @@
                 <w:rFonts w:ascii="Arial" w:hAnsi="Arial"/>
                 <w:sz w:val="20"/>
               </w:rPr>
-              <w:t>Equipos de prueba y conectividad móvil provistos por la organización</w:t>
+              <w:t>Costo total valorado del proyecto de mejora</w:t>
             </w:r>
           </w:p>
         </w:tc>
         <w:tc>
           <w:tcPr>
-            <w:tcW w:type="dxa" w:w="1440"/>
+            <w:tcW w:w="1303" w:type="dxa"/>
+          </w:tcPr>
+          <w:p>
+            <w:pPr>
+              <w:keepNext/>
+              <w:spacing w:before="60" w:after="60"/>
+              <w:jc w:val="left"/>
+            </w:pPr>
+            <w:r>
+              <w:rPr>
+                <w:rFonts w:ascii="Arial" w:hAnsi="Arial"/>
+                <w:sz w:val="20"/>
+              </w:rPr>
+              <w:t>12900.00</w:t>
+            </w:r>
+          </w:p>
+        </w:tc>
+      </w:tr>
+    </w:tbl>
+    <w:p>
+      <w:pPr>
+        <w:pStyle w:val="Descripcin"/>
+        <w:jc w:val="center"/>
+        <w:rPr>
+          <w:i w:val="0"/>
+          <w:iCs w:val="0"/>
+          <w:color w:val="auto"/>
+          <w:sz w:val="20"/>
+          <w:szCs w:val="20"/>
+        </w:rPr>
+      </w:pPr>
+      <w:r>
+        <w:rPr>
+          <w:i w:val="0"/>
+          <w:iCs w:val="0"/>
+          <w:color w:val="auto"/>
+          <w:sz w:val="20"/>
+          <w:szCs w:val="20"/>
+        </w:rPr>
+        <w:t xml:space="preserve">Tabla </w:t>
+      </w:r>
+      <w:r>
+        <w:rPr>
+          <w:i w:val="0"/>
+          <w:iCs w:val="0"/>
+          <w:color w:val="auto"/>
+          <w:sz w:val="20"/>
+          <w:szCs w:val="20"/>
+        </w:rPr>
+        <w:fldChar w:fldCharType="begin"/>
+      </w:r>
+      <w:r>
+        <w:rPr>
+          <w:i w:val="0"/>
+          <w:iCs w:val="0"/>
+          <w:color w:val="auto"/>
+          <w:sz w:val="20"/>
+          <w:szCs w:val="20"/>
+        </w:rPr>
+        <w:instrText xml:space="preserve"> SEQ Tabla \* ARABIC </w:instrText>
+      </w:r>
+      <w:r>
+        <w:rPr>
+          <w:i w:val="0"/>
+          <w:iCs w:val="0"/>
+          <w:color w:val="auto"/>
+          <w:sz w:val="20"/>
+          <w:szCs w:val="20"/>
+        </w:rPr>
+        <w:fldChar w:fldCharType="separate"/>
+      </w:r>
+      <w:r>
+        <w:rPr>
+          <w:i w:val="0"/>
+          <w:iCs w:val="0"/>
+          <w:noProof/>
+          <w:color w:val="auto"/>
+          <w:sz w:val="20"/>
+          <w:szCs w:val="20"/>
+        </w:rPr>
+        <w:t>5</w:t>
+      </w:r>
+      <w:r>
+        <w:rPr>
+          <w:i w:val="0"/>
+          <w:iCs w:val="0"/>
+          <w:color w:val="auto"/>
+          <w:sz w:val="20"/>
+          <w:szCs w:val="20"/>
+        </w:rPr>
+        <w:fldChar w:fldCharType="end"/>
+      </w:r>
+      <w:r>
+        <w:rPr>
+          <w:i w:val="0"/>
+          <w:iCs w:val="0"/>
+          <w:color w:val="auto"/>
+          <w:sz w:val="20"/>
+          <w:szCs w:val="20"/>
+        </w:rPr>
+        <w:t>. Costos directos asociados al desarrollo e infraestructura del proyecto.</w:t>
+      </w:r>
+    </w:p>
+    <w:p>
+      <w:pPr>
+        <w:spacing w:after="120"/>
+      </w:pPr>
+    </w:p>
+    <w:p>
+      <w:pPr>
+        <w:keepNext/>
+        <w:spacing w:before="280" w:after="120"/>
+        <w:jc w:val="left"/>
+      </w:pPr>
+      <w:r>
+        <w:rPr>
+          <w:rFonts w:ascii="Arial" w:hAnsi="Arial"/>
+          <w:b/>
+          <w:sz w:val="28"/>
+        </w:rPr>
+        <w:t xml:space="preserve">4.3. Resultados </w:t>
+      </w:r>
+      <w:r>
+        <w:rPr>
+          <w:rFonts w:ascii="Arial" w:hAnsi="Arial"/>
+          <w:b/>
+          <w:sz w:val="28"/>
+        </w:rPr>
+        <w:t>y beneficios obtenidos de la implementación</w:t>
+      </w:r>
+    </w:p>
+    <w:p>
+      <w:pPr>
+        <w:spacing w:after="120"/>
+      </w:pPr>
+      <w:r>
+        <w:rPr>
+          <w:rFonts w:ascii="Arial" w:hAnsi="Arial"/>
+        </w:rPr>
+        <w:t>Los resultados de la validación operativa se contrastan directamente con el objetivo inicial del proyecto, el cual contempla agilizar el control de servicios, eliminar el uso de bitácoras físicas de papel y reduc</w:t>
+      </w:r>
+      <w:r>
+        <w:rPr>
+          <w:rFonts w:ascii="Arial" w:hAnsi="Arial"/>
+        </w:rPr>
+        <w:t>ir en al menos un 80% el tiempo administrativo invertido en la generación de reportes técnicos de motores.</w:t>
+      </w:r>
+    </w:p>
+    <w:p>
+      <w:pPr>
+        <w:spacing w:after="120"/>
+      </w:pPr>
+      <w:r>
+        <w:rPr>
+          <w:rFonts w:ascii="Arial" w:hAnsi="Arial"/>
+        </w:rPr>
+        <w:t>El primer beneficio cuantitativo se registra en el tiempo requerido para compilar la información de cierre y entregar el reporte formal al cliente. C</w:t>
+      </w:r>
+      <w:r>
+        <w:rPr>
+          <w:rFonts w:ascii="Arial" w:hAnsi="Arial"/>
+        </w:rPr>
+        <w:t>on el esquema manual, el proceso (que involucra la recolección de firmas, transcripción de comentarios y digitalización de imágenes de cámaras compactas) toma un promedio de 24 horas hábiles por orden. Con la plataforma ServiControl, el reporte se genera d</w:t>
+      </w:r>
+      <w:r>
+        <w:rPr>
+          <w:rFonts w:ascii="Arial" w:hAnsi="Arial"/>
+        </w:rPr>
+        <w:t>e forma instantánea al momento en que el técnico presiona el botón de finalizar servicio, reduciendo el tiempo a cero horas y logrando una mejora del 100% en la disponibilidad del reporte. En la Figura 29 se presenta un gráfico comparativo que ilustra esta</w:t>
+      </w:r>
+      <w:r>
+        <w:rPr>
+          <w:rFonts w:ascii="Arial" w:hAnsi="Arial"/>
+        </w:rPr>
+        <w:t xml:space="preserve"> disminución de tiempos.</w:t>
+      </w:r>
+    </w:p>
+    <w:p>
+      <w:pPr>
+        <w:keepNext/>
+        <w:spacing w:before="120" w:after="240"/>
+        <w:jc w:val="center"/>
+      </w:pPr>
+      <w:r>
+        <w:rPr>
+          <w:rFonts w:ascii="Arial" w:hAnsi="Arial"/>
+          <w:sz w:val="20"/>
+        </w:rPr>
+        <w:lastRenderedPageBreak/>
+        <w:t>Figura 29. Comparativa del tiempo empleado en la gestión y generación de reportes (antes vs. después).</w:t>
+      </w:r>
+    </w:p>
+    <w:p>
+      <w:pPr>
+        <w:spacing w:after="120"/>
+      </w:pPr>
+      <w:r>
+        <w:rPr>
+          <w:rFonts w:ascii="Arial" w:hAnsi="Arial"/>
+        </w:rPr>
+        <w:t xml:space="preserve">El segundo beneficio consiste en la eliminación de pérdidas de información. Las auditorías de control interno revelan que en el </w:t>
+      </w:r>
+      <w:r>
+        <w:rPr>
+          <w:rFonts w:ascii="Arial" w:hAnsi="Arial"/>
+        </w:rPr>
+        <w:t xml:space="preserve">proceso anterior se extravía o daña un 12% de las bitácoras físicas debido al manejo de fluidos en el área de motores o la pérdida física de hojas. Tras la implementación del sistema digitalizado, la tasa de pérdida de información se reduce al 0% debido a </w:t>
+      </w:r>
+      <w:r>
+        <w:rPr>
+          <w:rFonts w:ascii="Arial" w:hAnsi="Arial"/>
+        </w:rPr>
+        <w:t>que los datos de las órdenes, consumos de inventario y evidencias fotográficas se almacenan directamente en la base de datos centralizada de Supabase.</w:t>
+      </w:r>
+    </w:p>
+    <w:p>
+      <w:pPr>
+        <w:spacing w:after="120"/>
+      </w:pPr>
+      <w:r>
+        <w:rPr>
+          <w:rFonts w:ascii="Arial" w:hAnsi="Arial"/>
+        </w:rPr>
+        <w:t>El tercer beneficio abarca la veracidad de la presencia del técnico en sitio. El sistema anterior no cuen</w:t>
+      </w:r>
+      <w:r>
+        <w:rPr>
+          <w:rFonts w:ascii="Arial" w:hAnsi="Arial"/>
+        </w:rPr>
+        <w:t>ta con herramientas para validar geográficamente la ejecución del mantenimiento. La plataforma actual implementa un registro coordinado de GPS que compara la coordenada objetivo asignada por el administrador con la coordenada real capturada por el sensor d</w:t>
+      </w:r>
+      <w:r>
+        <w:rPr>
+          <w:rFonts w:ascii="Arial" w:hAnsi="Arial"/>
+        </w:rPr>
+        <w:t>el dispositivo del técnico al iniciar e informar el servicio. Esto proporciona una trazabilidad del 100% sobre la ubicación física de las actividades de campo. En la Tabla 6 se comparan de forma sintetizada las métricas clave antes y después de la implemen</w:t>
+      </w:r>
+      <w:r>
+        <w:rPr>
+          <w:rFonts w:ascii="Arial" w:hAnsi="Arial"/>
+        </w:rPr>
+        <w:t>tación de la mejora.</w:t>
+      </w:r>
+    </w:p>
+    <w:p>
+      <w:pPr>
+        <w:spacing w:before="240" w:after="80"/>
+      </w:pPr>
+      <w:r>
+        <w:rPr>
+          <w:rFonts w:ascii="Arial" w:hAnsi="Arial"/>
+          <w:sz w:val="20"/>
+        </w:rPr>
+        <w:t>Tabla 6. Comparación de indicadores de desempeño operativos</w:t>
+      </w:r>
+    </w:p>
+    <w:tbl>
+      <w:tblPr>
+        <w:tblStyle w:val="Tablaconcuadrcula"/>
+        <w:tblW w:w="0" w:type="auto"/>
+        <w:tblLook w:val="04A0" w:firstRow="1" w:lastRow="0" w:firstColumn="1" w:lastColumn="0" w:noHBand="0" w:noVBand="1"/>
+      </w:tblPr>
+      <w:tblGrid>
+        <w:gridCol w:w="2716"/>
+        <w:gridCol w:w="2101"/>
+        <w:gridCol w:w="2276"/>
+        <w:gridCol w:w="1451"/>
+      </w:tblGrid>
+      <w:tr>
+        <w:tc>
+          <w:tcPr>
+            <w:tcW w:w="3600" w:type="dxa"/>
           </w:tcPr>
           <w:p>
             <w:pPr>
@@ -21664,9 +22307,67 @@
             <w:r>
               <w:rPr>
                 <w:rFonts w:ascii="Arial" w:hAnsi="Arial"/>
-                <w:sz w:val="20"/>
-              </w:rPr>
-              <w:t>0.00</w:t>
+                <w:b/>
+                <w:sz w:val="20"/>
+              </w:rPr>
+              <w:t>Indicador operativo</w:t>
+            </w:r>
+          </w:p>
+        </w:tc>
+        <w:tc>
+          <w:tcPr>
+            <w:tcW w:w="2592" w:type="dxa"/>
+          </w:tcPr>
+          <w:p>
+            <w:pPr>
+              <w:spacing w:before="60" w:after="60"/>
+              <w:jc w:val="left"/>
+            </w:pPr>
+            <w:r>
+              <w:rPr>
+                <w:rFonts w:ascii="Arial" w:hAnsi="Arial"/>
+                <w:b/>
+                <w:sz w:val="20"/>
+              </w:rPr>
+              <w:t>Escenario manual anterior</w:t>
+            </w:r>
+          </w:p>
+        </w:tc>
+        <w:tc>
+          <w:tcPr>
+            <w:tcW w:w="2592" w:type="dxa"/>
+          </w:tcPr>
+          <w:p>
+            <w:pPr>
+              <w:spacing w:before="60" w:after="60"/>
+              <w:jc w:val="left"/>
+            </w:pPr>
+            <w:r>
+              <w:rPr>
+                <w:rFonts w:ascii="Arial" w:hAnsi="Arial"/>
+                <w:b/>
+                <w:sz w:val="20"/>
+              </w:rPr>
+              <w:t>Escenario con ServiControl</w:t>
+            </w:r>
+          </w:p>
+        </w:tc>
+        <w:tc>
+          <w:tcPr>
+            <w:tcW w:w="1584" w:type="dxa"/>
+          </w:tcPr>
+          <w:p>
+            <w:pPr>
+              <w:spacing w:before="60" w:after="60"/>
+              <w:jc w:val="left"/>
+            </w:pPr>
+            <w:r>
+              <w:rPr>
+                <w:rFonts w:ascii="Arial" w:hAnsi="Arial"/>
+                <w:b/>
+                <w:sz w:val="20"/>
+              </w:rPr>
+              <w:t>Porcentaje de mejora</w:t>
             </w:r>
           </w:p>
         </w:tc>
@@ -21674,7 +22375,7 @@
       <w:tr>
         <w:tc>
           <w:tcPr>
-            <w:tcW w:type="dxa" w:w="2592"/>
+            <w:tcW w:w="3600" w:type="dxa"/>
           </w:tcPr>
           <w:p>
             <w:pPr>
@@ -21686,13 +22387,13 @@
                 <w:rFonts w:ascii="Arial" w:hAnsi="Arial"/>
                 <w:sz w:val="20"/>
               </w:rPr>
-              <w:t>Total de la inversión</w:t>
+              <w:t>Tiempo de entrega de reportes</w:t>
             </w:r>
           </w:p>
         </w:tc>
         <w:tc>
           <w:tcPr>
-            <w:tcW w:type="dxa" w:w="1728"/>
+            <w:tcW w:w="2592" w:type="dxa"/>
           </w:tcPr>
           <w:p>
             <w:pPr>
@@ -21704,13 +22405,13 @@
                 <w:rFonts w:ascii="Arial" w:hAnsi="Arial"/>
                 <w:sz w:val="20"/>
               </w:rPr>
-              <w:t>Finanzas</w:t>
+              <w:t>24 horas</w:t>
             </w:r>
           </w:p>
         </w:tc>
         <w:tc>
           <w:tcPr>
-            <w:tcW w:type="dxa" w:w="4608"/>
+            <w:tcW w:w="2592" w:type="dxa"/>
           </w:tcPr>
           <w:p>
             <w:pPr>
@@ -21722,13 +22423,13 @@
                 <w:rFonts w:ascii="Arial" w:hAnsi="Arial"/>
                 <w:sz w:val="20"/>
               </w:rPr>
-              <w:t>Costo total valorado del proyecto de mejora</w:t>
+              <w:t>0 horas (Instantáneo)</w:t>
             </w:r>
           </w:p>
         </w:tc>
         <w:tc>
           <w:tcPr>
-            <w:tcW w:type="dxa" w:w="1440"/>
+            <w:tcW w:w="1584" w:type="dxa"/>
           </w:tcPr>
           <w:p>
             <w:pPr>
@@ -21740,140 +22441,15 @@
                 <w:rFonts w:ascii="Arial" w:hAnsi="Arial"/>
                 <w:sz w:val="20"/>
               </w:rPr>
-              <w:t>48000.00</w:t>
+              <w:t>100%</w:t>
             </w:r>
           </w:p>
         </w:tc>
       </w:tr>
-    </w:tbl>
-    <w:p>
-      <w:pPr>
-        <w:spacing w:line="360" w:lineRule="auto" w:before="0" w:after="120"/>
-        <w:ind w:left="0" w:firstLine="0"/>
-        <w:jc w:val="both"/>
-      </w:pPr>
-      <w:r>
-        <w:rPr>
-          <w:rFonts w:ascii="Arial" w:hAnsi="Arial"/>
-          <w:sz w:val="24"/>
-        </w:rPr>
-        <w:t>La valoración de 48000.00 MXN constituye la inversión teórica acumulada del proyecto de desarrollo de software, aunque el desembolso neto real de capital por parte de la empresa para la implementación de la aplicación web equivale a 0.00 MXN.</w:t>
-      </w:r>
-    </w:p>
-    <w:p>
-      <w:pPr>
-        <w:keepNext/>
-        <w:spacing w:before="280" w:after="120"/>
-        <w:jc w:val="left"/>
-      </w:pPr>
-      <w:r>
-        <w:rPr>
-          <w:rFonts w:ascii="Arial" w:hAnsi="Arial"/>
-          <w:b/>
-          <w:sz w:val="28"/>
-        </w:rPr>
-        <w:t>4.3. Resultados y beneficios obtenidos de la implementación</w:t>
-      </w:r>
-    </w:p>
-    <w:p>
-      <w:pPr>
-        <w:spacing w:line="360" w:lineRule="auto" w:before="0" w:after="120"/>
-        <w:ind w:left="0" w:firstLine="0"/>
-        <w:jc w:val="both"/>
-      </w:pPr>
-      <w:r>
-        <w:rPr>
-          <w:rFonts w:ascii="Arial" w:hAnsi="Arial"/>
-          <w:sz w:val="24"/>
-        </w:rPr>
-        <w:t>Los resultados de la validación operativa se contrastan directamente con el objetivo inicial del proyecto, el cual contempla agilizar el control de servicios, eliminar el uso de bitácoras físicas de papel y reducir en al menos un 80% el tiempo administrativo invertido en la generación de reportes técnicos de motores.</w:t>
-      </w:r>
-    </w:p>
-    <w:p>
-      <w:pPr>
-        <w:spacing w:line="360" w:lineRule="auto" w:before="0" w:after="120"/>
-        <w:ind w:left="0" w:firstLine="0"/>
-        <w:jc w:val="both"/>
-      </w:pPr>
-      <w:r>
-        <w:rPr>
-          <w:rFonts w:ascii="Arial" w:hAnsi="Arial"/>
-          <w:sz w:val="24"/>
-        </w:rPr>
-        <w:t>El primer beneficio cuantitativo se registra en el tiempo requerido para compilar la información de cierre y entregar el reporte formal al cliente. Con el esquema manual, el proceso (que involucra la recolección de firmas, transcripción de comentarios y digitalización de imágenes de cámaras compactas) toma un promedio de 24 horas hábiles por orden. Con la plataforma ServiControl, el reporte se genera de forma instantánea al momento en que el técnico presiona el botón de finalizar servicio, reduciendo el tiempo a cero horas y logrando una mejora del 100% en la disponibilidad del reporte. En la Figura 29 se presenta un gráfico comparativo que ilustra esta disminución de tiempos.</w:t>
-      </w:r>
-    </w:p>
-    <w:p>
-      <w:pPr>
-        <w:keepNext/>
-        <w:spacing w:before="120" w:after="240"/>
-        <w:jc w:val="center"/>
-      </w:pPr>
-      <w:r>
-        <w:rPr>
-          <w:rFonts w:ascii="Arial" w:hAnsi="Arial"/>
-          <w:b w:val="0"/>
-          <w:sz w:val="20"/>
-        </w:rPr>
-        <w:t>Figura 29. Comparativa del tiempo empleado en la gestión y generación de reportes (antes vs. después).</w:t>
-      </w:r>
-    </w:p>
-    <w:p>
-      <w:pPr>
-        <w:spacing w:line="360" w:lineRule="auto" w:before="0" w:after="120"/>
-        <w:ind w:left="0" w:firstLine="0"/>
-        <w:jc w:val="both"/>
-      </w:pPr>
-      <w:r>
-        <w:rPr>
-          <w:rFonts w:ascii="Arial" w:hAnsi="Arial"/>
-          <w:sz w:val="24"/>
-        </w:rPr>
-        <w:t>El segundo beneficio consiste en la eliminación de pérdidas de información. Las auditorías de control interno revelan que en el proceso anterior se extravía o daña un 12% de las bitácoras físicas debido al manejo de fluidos en el área de motores o la pérdida física de hojas. Tras la implementación del sistema digitalizado, la tasa de pérdida de información se reduce al 0% debido a que los datos de las órdenes, consumos de inventario y evidencias fotográficas se almacenan directamente en la base de datos centralizada de Supabase.</w:t>
-      </w:r>
-    </w:p>
-    <w:p>
-      <w:pPr>
-        <w:spacing w:line="360" w:lineRule="auto" w:before="0" w:after="120"/>
-        <w:ind w:left="0" w:firstLine="0"/>
-        <w:jc w:val="both"/>
-      </w:pPr>
-      <w:r>
-        <w:rPr>
-          <w:rFonts w:ascii="Arial" w:hAnsi="Arial"/>
-          <w:sz w:val="24"/>
-        </w:rPr>
-        <w:t>El tercer beneficio abarca la veracidad de la presencia del técnico en sitio. El sistema anterior no cuenta con herramientas para validar geográficamente la ejecución del mantenimiento. La plataforma actual implementa un registro coordinado de GPS que compara la coordenada objetivo asignada por el administrador con la coordenada real capturada por el sensor del dispositivo del técnico al iniciar e informar el servicio. Esto proporciona una trazabilidad del 100% sobre la ubicación física de las actividades de campo. En la Tabla 6 se comparan de forma sintetizada las métricas clave antes y después de la implementación de la mejora.</w:t>
-      </w:r>
-    </w:p>
-    <w:p>
-      <w:pPr>
-        <w:spacing w:before="240" w:after="80"/>
-      </w:pPr>
-      <w:r>
-        <w:rPr>
-          <w:rFonts w:ascii="Arial" w:hAnsi="Arial"/>
-          <w:sz w:val="20"/>
-        </w:rPr>
-        <w:t>Tabla 6. Comparación de indicadores de desempeño operativos</w:t>
-      </w:r>
-    </w:p>
-    <w:tbl>
-      <w:tblPr>
-        <w:tblStyle w:val="Tablaconcuadrcula"/>
-        <w:tblW w:type="auto" w:w="0"/>
-        <w:tblLook w:firstColumn="1" w:firstRow="1" w:lastColumn="0" w:lastRow="0" w:noHBand="0" w:noVBand="1" w:val="04A0"/>
-      </w:tblPr>
-      <w:tblGrid>
-        <w:gridCol w:w="2138"/>
-        <w:gridCol w:w="2138"/>
-        <w:gridCol w:w="2138"/>
-        <w:gridCol w:w="2138"/>
-      </w:tblGrid>
       <w:tr>
         <w:tc>
           <w:tcPr>
-            <w:tcW w:type="dxa" w:w="3600"/>
+            <w:tcW w:w="3600" w:type="dxa"/>
           </w:tcPr>
           <w:p>
             <w:pPr>
@@ -21883,16 +22459,22 @@
             <w:r>
               <w:rPr>
                 <w:rFonts w:ascii="Arial" w:hAnsi="Arial"/>
-                <w:b/>
-                <w:sz w:val="20"/>
-              </w:rPr>
-              <w:t>Indicador operativo</w:t>
+                <w:sz w:val="20"/>
+              </w:rPr>
+              <w:t xml:space="preserve">Tasa de </w:t>
+            </w:r>
+            <w:r>
+              <w:rPr>
+                <w:rFonts w:ascii="Arial" w:hAnsi="Arial"/>
+                <w:sz w:val="20"/>
+              </w:rPr>
+              <w:t>pérdida de registros</w:t>
             </w:r>
           </w:p>
         </w:tc>
         <w:tc>
           <w:tcPr>
-            <w:tcW w:type="dxa" w:w="2592"/>
+            <w:tcW w:w="2592" w:type="dxa"/>
           </w:tcPr>
           <w:p>
             <w:pPr>
@@ -21902,16 +22484,15 @@
             <w:r>
               <w:rPr>
                 <w:rFonts w:ascii="Arial" w:hAnsi="Arial"/>
-                <w:b/>
-                <w:sz w:val="20"/>
-              </w:rPr>
-              <w:t>Escenario manual anterior</w:t>
+                <w:sz w:val="20"/>
+              </w:rPr>
+              <w:t>12% de bitácoras</w:t>
             </w:r>
           </w:p>
         </w:tc>
         <w:tc>
           <w:tcPr>
-            <w:tcW w:type="dxa" w:w="2592"/>
+            <w:tcW w:w="2592" w:type="dxa"/>
           </w:tcPr>
           <w:p>
             <w:pPr>
@@ -21921,16 +22502,15 @@
             <w:r>
               <w:rPr>
                 <w:rFonts w:ascii="Arial" w:hAnsi="Arial"/>
-                <w:b/>
-                <w:sz w:val="20"/>
-              </w:rPr>
-              <w:t>Escenario con ServiControl</w:t>
+                <w:sz w:val="20"/>
+              </w:rPr>
+              <w:t>0% (Almacenamiento digital)</w:t>
             </w:r>
           </w:p>
         </w:tc>
         <w:tc>
           <w:tcPr>
-            <w:tcW w:type="dxa" w:w="1584"/>
+            <w:tcW w:w="1584" w:type="dxa"/>
           </w:tcPr>
           <w:p>
             <w:pPr>
@@ -21940,10 +22520,9 @@
             <w:r>
               <w:rPr>
                 <w:rFonts w:ascii="Arial" w:hAnsi="Arial"/>
-                <w:b/>
-                <w:sz w:val="20"/>
-              </w:rPr>
-              <w:t>Porcentaje de mejora</w:t>
+                <w:sz w:val="20"/>
+              </w:rPr>
+              <w:t>100%</w:t>
             </w:r>
           </w:p>
         </w:tc>
@@ -21951,7 +22530,7 @@
       <w:tr>
         <w:tc>
           <w:tcPr>
-            <w:tcW w:type="dxa" w:w="3600"/>
+            <w:tcW w:w="3600" w:type="dxa"/>
           </w:tcPr>
           <w:p>
             <w:pPr>
@@ -21963,13 +22542,13 @@
                 <w:rFonts w:ascii="Arial" w:hAnsi="Arial"/>
                 <w:sz w:val="20"/>
               </w:rPr>
-              <w:t>Tiempo de entrega de reportes</w:t>
+              <w:t>Trazabilidad geográfica</w:t>
             </w:r>
           </w:p>
         </w:tc>
         <w:tc>
           <w:tcPr>
-            <w:tcW w:type="dxa" w:w="2592"/>
+            <w:tcW w:w="2592" w:type="dxa"/>
           </w:tcPr>
           <w:p>
             <w:pPr>
@@ -21981,13 +22560,13 @@
                 <w:rFonts w:ascii="Arial" w:hAnsi="Arial"/>
                 <w:sz w:val="20"/>
               </w:rPr>
-              <w:t>24 horas</w:t>
+              <w:t>0% (Inexistente)</w:t>
             </w:r>
           </w:p>
         </w:tc>
         <w:tc>
           <w:tcPr>
-            <w:tcW w:type="dxa" w:w="2592"/>
+            <w:tcW w:w="2592" w:type="dxa"/>
           </w:tcPr>
           <w:p>
             <w:pPr>
@@ -21999,13 +22578,13 @@
                 <w:rFonts w:ascii="Arial" w:hAnsi="Arial"/>
                 <w:sz w:val="20"/>
               </w:rPr>
-              <w:t>0 horas (Instantáneo)</w:t>
+              <w:t>100% (GPS vs Objetivo)</w:t>
             </w:r>
           </w:p>
         </w:tc>
         <w:tc>
           <w:tcPr>
-            <w:tcW w:type="dxa" w:w="1584"/>
+            <w:tcW w:w="1584" w:type="dxa"/>
           </w:tcPr>
           <w:p>
             <w:pPr>
@@ -22025,7 +22604,7 @@
       <w:tr>
         <w:tc>
           <w:tcPr>
-            <w:tcW w:type="dxa" w:w="3600"/>
+            <w:tcW w:w="3600" w:type="dxa"/>
           </w:tcPr>
           <w:p>
             <w:pPr>
@@ -22037,13 +22616,13 @@
                 <w:rFonts w:ascii="Arial" w:hAnsi="Arial"/>
                 <w:sz w:val="20"/>
               </w:rPr>
-              <w:t>Tasa de pérdida de registros</w:t>
+              <w:t>Error en consumo de inventario</w:t>
             </w:r>
           </w:p>
         </w:tc>
         <w:tc>
           <w:tcPr>
-            <w:tcW w:type="dxa" w:w="2592"/>
+            <w:tcW w:w="2592" w:type="dxa"/>
           </w:tcPr>
           <w:p>
             <w:pPr>
@@ -22055,13 +22634,13 @@
                 <w:rFonts w:ascii="Arial" w:hAnsi="Arial"/>
                 <w:sz w:val="20"/>
               </w:rPr>
-              <w:t>12% de bitácoras</w:t>
+              <w:t>Alto (Desfases semanales)</w:t>
             </w:r>
           </w:p>
         </w:tc>
         <w:tc>
           <w:tcPr>
-            <w:tcW w:type="dxa" w:w="2592"/>
+            <w:tcW w:w="2592" w:type="dxa"/>
           </w:tcPr>
           <w:p>
             <w:pPr>
@@ -22073,13 +22652,13 @@
                 <w:rFonts w:ascii="Arial" w:hAnsi="Arial"/>
                 <w:sz w:val="20"/>
               </w:rPr>
-              <w:t>0% (Almacenamiento digital)</w:t>
+              <w:t>Nulo (Descuento síncrono)</w:t>
             </w:r>
           </w:p>
         </w:tc>
         <w:tc>
           <w:tcPr>
-            <w:tcW w:type="dxa" w:w="1584"/>
+            <w:tcW w:w="1584" w:type="dxa"/>
           </w:tcPr>
           <w:p>
             <w:pPr>
@@ -22091,7 +22670,253 @@
                 <w:rFonts w:ascii="Arial" w:hAnsi="Arial"/>
                 <w:sz w:val="20"/>
               </w:rPr>
-              <w:t>100%</w:t>
+              <w:t>98%</w:t>
+            </w:r>
+          </w:p>
+        </w:tc>
+      </w:tr>
+    </w:tbl>
+    <w:p>
+      <w:pPr>
+        <w:keepNext/>
+        <w:spacing w:before="280" w:after="120"/>
+        <w:jc w:val="left"/>
+      </w:pPr>
+      <w:r>
+        <w:rPr>
+          <w:rFonts w:ascii="Arial" w:hAnsi="Arial"/>
+          <w:b/>
+          <w:sz w:val="28"/>
+        </w:rPr>
+        <w:lastRenderedPageBreak/>
+        <w:t>4.4. Tiempo estimado de la</w:t>
+      </w:r>
+      <w:r>
+        <w:rPr>
+          <w:rFonts w:ascii="Arial" w:hAnsi="Arial"/>
+          <w:b/>
+          <w:sz w:val="28"/>
+        </w:rPr>
+        <w:t xml:space="preserve"> recuperación de la inversión</w:t>
+      </w:r>
+    </w:p>
+    <w:p>
+      <w:pPr>
+        <w:spacing w:after="120"/>
+      </w:pPr>
+      <w:r>
+        <w:rPr>
+          <w:rFonts w:ascii="Arial" w:hAnsi="Arial"/>
+        </w:rPr>
+        <w:t>El Retorno de la Inversión (ROI) y el periodo de amortización se calculan traduciendo los beneficios operativos del sistema a términos financieros de ahorro de mano de obra y reducción de desperdicios de material.</w:t>
+      </w:r>
+    </w:p>
+    <w:p>
+      <w:pPr>
+        <w:spacing w:after="120"/>
+      </w:pPr>
+      <w:r>
+        <w:rPr>
+          <w:rFonts w:ascii="Arial" w:hAnsi="Arial"/>
+        </w:rPr>
+        <w:t xml:space="preserve">En </w:t>
+      </w:r>
+      <w:r>
+        <w:rPr>
+          <w:rFonts w:ascii="Arial" w:hAnsi="Arial"/>
+        </w:rPr>
+        <w:t>primer lugar, se determina el beneficio económico mensual. La reducción de dos horas de papeleo por orden de servicio, en un flujo de trabajo de 150 órdenes mensuales, representa un ahorro de 300 horas al mes. Considerando un costo por hora de mano de obra</w:t>
+      </w:r>
+      <w:r>
+        <w:rPr>
+          <w:rFonts w:ascii="Arial" w:hAnsi="Arial"/>
+        </w:rPr>
+        <w:t xml:space="preserve"> de auxiliar administrativo en México de $45.00 MXN (basado en un sueldo mensual promedio de $8000.00 MXN por 180 horas de jornada laboral), el ahorro mensual directo por mano de obra equivale a $13500.00 MXN. A esta cifra se adiciona un ahorro promedio me</w:t>
+      </w:r>
+      <w:r>
+        <w:rPr>
+          <w:rFonts w:ascii="Arial" w:hAnsi="Arial"/>
+        </w:rPr>
+        <w:t>nsual estimado de $2000.00 MXN derivado del control exacto de consumos de insumos en sitio, lo cual evita pérdidas de repuestos y materiales de motores. De esta manera, el ahorro mensual total consolidado asciende a $15500.00 MXN.</w:t>
+      </w:r>
+    </w:p>
+    <w:p>
+      <w:pPr>
+        <w:spacing w:after="120"/>
+      </w:pPr>
+      <w:r>
+        <w:rPr>
+          <w:rFonts w:ascii="Arial" w:hAnsi="Arial"/>
+        </w:rPr>
+        <w:t>En segundo lugar, se anal</w:t>
+      </w:r>
+      <w:r>
+        <w:rPr>
+          <w:rFonts w:ascii="Arial" w:hAnsi="Arial"/>
+        </w:rPr>
+        <w:t>iza el periodo de recuperación de la inversión desde dos enfoques contables distintos:</w:t>
+      </w:r>
+    </w:p>
+    <w:p>
+      <w:pPr>
+        <w:spacing w:after="80" w:line="360" w:lineRule="auto"/>
+        <w:ind w:left="576" w:hanging="288"/>
+        <w:jc w:val="both"/>
+      </w:pPr>
+      <w:r/>
+      <w:r>
+        <w:rPr>
+          <w:rFonts w:ascii="Arial" w:hAnsi="Arial"/>
+          <w:sz w:val="24"/>
+        </w:rPr>
+        <w:t xml:space="preserve">• </w:t>
+      </w:r>
+      <w:r>
+        <w:rPr>
+          <w:rFonts w:ascii="Arial" w:hAnsi="Arial"/>
+          <w:sz w:val="24"/>
+        </w:rPr>
+        <w:t>Enfoque de Inversión Teórica (Mercado): Al dividir la valoración total de la inversión ($12900.00 MXN) entre el beneficio económico mensual ($15500.00 MXN), se obtiene un periodo de recuperación de 0.83 meses, lo que equivale a aproximadamente 25 días de operación.</w:t>
+      </w:r>
+    </w:p>
+    <w:p>
+      <w:pPr>
+        <w:spacing w:after="80" w:line="360" w:lineRule="auto"/>
+        <w:ind w:left="576" w:hanging="288"/>
+        <w:jc w:val="both"/>
+      </w:pPr>
+      <w:r/>
+      <w:r>
+        <w:rPr>
+          <w:rFonts w:ascii="Arial" w:hAnsi="Arial"/>
+          <w:sz w:val="24"/>
+        </w:rPr>
+        <w:t xml:space="preserve">• </w:t>
+      </w:r>
+      <w:r>
+        <w:rPr>
+          <w:rFonts w:ascii="Arial" w:hAnsi="Arial"/>
+          <w:sz w:val="24"/>
+        </w:rPr>
+        <w:t>Enfoque de Inversión Real (Flujo de Caja): Dado que el desarrollo del software se realiza bajo el esquema de estadías académicas, el desembolso financiero real inicial por mano de obra equivale a $0.00 MXN. Al considerar el costo real recurrente mensual de la infraestructura en la nube ($900.00 MXN), el beneficio neto de ahorro mensual real se sitúa en $14600.00 MXN ($15500.00 MXN de ahorro mensual menos $900.00 MXN de costo de nube). Por consiguiente, la amortización real es inmediata y se consolida un ahorro operativo neto positivo desde el primer mes de operaciones.</w:t>
+      </w:r>
+    </w:p>
+    <w:p>
+      <w:pPr>
+        <w:spacing w:after="120"/>
+      </w:pPr>
+      <w:r>
+        <w:rPr>
+          <w:rFonts w:ascii="Arial" w:hAnsi="Arial"/>
+        </w:rPr>
+        <w:t>En tercer lugar, se eval</w:t>
+      </w:r>
+      <w:r>
+        <w:rPr>
+          <w:rFonts w:ascii="Arial" w:hAnsi="Arial"/>
+        </w:rPr>
+        <w:t>úan los costos recurrentes de mantenimiento mensual para asegurar la viabilidad operativa a largo plazo. Estos se resumen en la Tabla 7.</w:t>
+      </w:r>
+    </w:p>
+    <w:p>
+      <w:pPr>
+        <w:spacing w:before="240" w:after="80"/>
+      </w:pPr>
+      <w:r>
+        <w:rPr>
+          <w:rFonts w:ascii="Arial" w:hAnsi="Arial"/>
+          <w:sz w:val="20"/>
+        </w:rPr>
+        <w:lastRenderedPageBreak/>
+        <w:t>Tabla 7. Desglose de costos mensuales de mantenimiento del sistema</w:t>
+      </w:r>
+    </w:p>
+    <w:tbl>
+      <w:tblPr>
+        <w:tblStyle w:val="Tablaconcuadrcula"/>
+        <w:tblW w:w="0" w:type="auto"/>
+        <w:tblLook w:val="04A0" w:firstRow="1" w:lastRow="0" w:firstColumn="1" w:lastColumn="0" w:noHBand="0" w:noVBand="1"/>
+      </w:tblPr>
+      <w:tblGrid>
+        <w:gridCol w:w="2445"/>
+        <w:gridCol w:w="1334"/>
+        <w:gridCol w:w="3469"/>
+        <w:gridCol w:w="1296"/>
+      </w:tblGrid>
+      <w:tr>
+        <w:tc>
+          <w:tcPr>
+            <w:tcW w:w="2880" w:type="dxa"/>
+          </w:tcPr>
+          <w:p>
+            <w:pPr>
+              <w:spacing w:before="60" w:after="60"/>
+              <w:jc w:val="left"/>
+            </w:pPr>
+            <w:r>
+              <w:rPr>
+                <w:rFonts w:ascii="Arial" w:hAnsi="Arial"/>
+                <w:b/>
+                <w:sz w:val="20"/>
+              </w:rPr>
+              <w:t>Concepto de mantenimiento</w:t>
+            </w:r>
+          </w:p>
+        </w:tc>
+        <w:tc>
+          <w:tcPr>
+            <w:tcW w:w="1440" w:type="dxa"/>
+          </w:tcPr>
+          <w:p>
+            <w:pPr>
+              <w:spacing w:before="60" w:after="60"/>
+              <w:jc w:val="left"/>
+            </w:pPr>
+            <w:r>
+              <w:rPr>
+                <w:rFonts w:ascii="Arial" w:hAnsi="Arial"/>
+                <w:b/>
+                <w:sz w:val="20"/>
+              </w:rPr>
+              <w:t>Categoría</w:t>
+            </w:r>
+          </w:p>
+        </w:tc>
+        <w:tc>
+          <w:tcPr>
+            <w:tcW w:w="4608" w:type="dxa"/>
+          </w:tcPr>
+          <w:p>
+            <w:pPr>
+              <w:spacing w:before="60" w:after="60"/>
+              <w:jc w:val="left"/>
+            </w:pPr>
+            <w:r>
+              <w:rPr>
+                <w:rFonts w:ascii="Arial" w:hAnsi="Arial"/>
+                <w:b/>
+                <w:sz w:val="20"/>
+              </w:rPr>
+              <w:t>Descripción</w:t>
+            </w:r>
+          </w:p>
+        </w:tc>
+        <w:tc>
+          <w:tcPr>
+            <w:tcW w:w="1440" w:type="dxa"/>
+          </w:tcPr>
+          <w:p>
+            <w:pPr>
+              <w:spacing w:before="60" w:after="60"/>
+              <w:jc w:val="left"/>
+            </w:pPr>
+            <w:r>
+              <w:rPr>
+                <w:rFonts w:ascii="Arial" w:hAnsi="Arial"/>
+                <w:b/>
+                <w:sz w:val="20"/>
+              </w:rPr>
+              <w:t>Costo mensual (MXN)</w:t>
             </w:r>
           </w:p>
         </w:tc>
@@ -22099,7 +22924,7 @@
       <w:tr>
         <w:tc>
           <w:tcPr>
-            <w:tcW w:type="dxa" w:w="3600"/>
+            <w:tcW w:w="2880" w:type="dxa"/>
           </w:tcPr>
           <w:p>
             <w:pPr>
@@ -22111,13 +22936,13 @@
                 <w:rFonts w:ascii="Arial" w:hAnsi="Arial"/>
                 <w:sz w:val="20"/>
               </w:rPr>
-              <w:t>Trazabilidad geográfica</w:t>
+              <w:t>Servidor en la nube y hosting</w:t>
             </w:r>
           </w:p>
         </w:tc>
         <w:tc>
           <w:tcPr>
-            <w:tcW w:type="dxa" w:w="2592"/>
+            <w:tcW w:w="1440" w:type="dxa"/>
           </w:tcPr>
           <w:p>
             <w:pPr>
@@ -22129,13 +22954,13 @@
                 <w:rFonts w:ascii="Arial" w:hAnsi="Arial"/>
                 <w:sz w:val="20"/>
               </w:rPr>
-              <w:t>0% (Inexistente)</w:t>
+              <w:t>Nube</w:t>
             </w:r>
           </w:p>
         </w:tc>
         <w:tc>
           <w:tcPr>
-            <w:tcW w:type="dxa" w:w="2592"/>
+            <w:tcW w:w="4608" w:type="dxa"/>
           </w:tcPr>
           <w:p>
             <w:pPr>
@@ -22147,13 +22972,13 @@
                 <w:rFonts w:ascii="Arial" w:hAnsi="Arial"/>
                 <w:sz w:val="20"/>
               </w:rPr>
-              <w:t>100% (GPS vs Objetivo)</w:t>
+              <w:t>Planes pro de Supabase y Vercel para producción (Costo mensual)</w:t>
             </w:r>
           </w:p>
         </w:tc>
         <w:tc>
           <w:tcPr>
-            <w:tcW w:type="dxa" w:w="1584"/>
+            <w:tcW w:w="1440" w:type="dxa"/>
           </w:tcPr>
           <w:p>
             <w:pPr>
@@ -22165,7 +22990,7 @@
                 <w:rFonts w:ascii="Arial" w:hAnsi="Arial"/>
                 <w:sz w:val="20"/>
               </w:rPr>
-              <w:t>100%</w:t>
+              <w:t>900.00</w:t>
             </w:r>
           </w:p>
         </w:tc>
@@ -22173,7 +22998,7 @@
       <w:tr>
         <w:tc>
           <w:tcPr>
-            <w:tcW w:type="dxa" w:w="3600"/>
+            <w:tcW w:w="2880" w:type="dxa"/>
           </w:tcPr>
           <w:p>
             <w:pPr>
@@ -22185,13 +23010,13 @@
                 <w:rFonts w:ascii="Arial" w:hAnsi="Arial"/>
                 <w:sz w:val="20"/>
               </w:rPr>
-              <w:t>Error en consumo de inventario</w:t>
+              <w:t>Soporte técnico del sistema</w:t>
             </w:r>
           </w:p>
         </w:tc>
         <w:tc>
           <w:tcPr>
-            <w:tcW w:type="dxa" w:w="2592"/>
+            <w:tcW w:w="1440" w:type="dxa"/>
           </w:tcPr>
           <w:p>
             <w:pPr>
@@ -22203,13 +23028,13 @@
                 <w:rFonts w:ascii="Arial" w:hAnsi="Arial"/>
                 <w:sz w:val="20"/>
               </w:rPr>
-              <w:t>Alto (Desfases semanales)</w:t>
+              <w:t>Mano de obra</w:t>
             </w:r>
           </w:p>
         </w:tc>
         <w:tc>
           <w:tcPr>
-            <w:tcW w:type="dxa" w:w="2592"/>
+            <w:tcW w:w="4608" w:type="dxa"/>
           </w:tcPr>
           <w:p>
             <w:pPr>
@@ -22221,13 +23046,13 @@
                 <w:rFonts w:ascii="Arial" w:hAnsi="Arial"/>
                 <w:sz w:val="20"/>
               </w:rPr>
-              <w:t>Nulo (Descuento síncrono)</w:t>
+              <w:t>Soporte interno de tecnologías de información (2 horas estimadas a $400.00 MXN por hora)</w:t>
             </w:r>
           </w:p>
         </w:tc>
         <w:tc>
           <w:tcPr>
-            <w:tcW w:type="dxa" w:w="1584"/>
+            <w:tcW w:w="1440" w:type="dxa"/>
           </w:tcPr>
           <w:p>
             <w:pPr>
@@ -22239,153 +23064,15 @@
                 <w:rFonts w:ascii="Arial" w:hAnsi="Arial"/>
                 <w:sz w:val="20"/>
               </w:rPr>
-              <w:t>98%</w:t>
+              <w:t>800.00</w:t>
             </w:r>
           </w:p>
         </w:tc>
       </w:tr>
-    </w:tbl>
-    <w:p>
-      <w:pPr>
-        <w:keepNext/>
-        <w:spacing w:before="280" w:after="120"/>
-        <w:jc w:val="left"/>
-      </w:pPr>
-      <w:r>
-        <w:rPr>
-          <w:rFonts w:ascii="Arial" w:hAnsi="Arial"/>
-          <w:b/>
-          <w:sz w:val="28"/>
-        </w:rPr>
-        <w:t>4.4. Tiempo estimado de la recuperación de la inversión</w:t>
-      </w:r>
-    </w:p>
-    <w:p>
-      <w:pPr>
-        <w:spacing w:line="360" w:lineRule="auto" w:before="0" w:after="120"/>
-        <w:ind w:left="0" w:firstLine="0"/>
-        <w:jc w:val="both"/>
-      </w:pPr>
-      <w:r>
-        <w:rPr>
-          <w:rFonts w:ascii="Arial" w:hAnsi="Arial"/>
-          <w:sz w:val="24"/>
-        </w:rPr>
-        <w:t>El Retorno de la Inversión (ROI) y el periodo de amortización se calculan traduciendo los beneficios operativos del sistema a términos financieros de ahorro de mano de obra y reducción de desperdicios de material.</w:t>
-      </w:r>
-    </w:p>
-    <w:p>
-      <w:pPr>
-        <w:spacing w:line="360" w:lineRule="auto" w:before="0" w:after="120"/>
-        <w:ind w:left="0" w:firstLine="0"/>
-        <w:jc w:val="both"/>
-      </w:pPr>
-      <w:r>
-        <w:rPr>
-          <w:rFonts w:ascii="Arial" w:hAnsi="Arial"/>
-          <w:sz w:val="24"/>
-        </w:rPr>
-        <w:t>En primer lugar, se determina el beneficio económico mensual. La reducción de dos horas de papeleo por orden de servicio, en un flujo de trabajo de 150 órdenes mensuales, representa un ahorro de 300 horas al mes. Considerando un costo por hora de mano de obra de auxiliar administrativo en México de $45.00 MXN (basado en un sueldo mensual promedio de $8000.00 MXN por 180 horas de jornada laboral), el ahorro mensual directo por mano de obra equivale a $13500.00 MXN. A esta cifra se adiciona un ahorro promedio mensual estimado de $2000.00 MXN derivado del control exacto de consumos de insumos en sitio, lo cual evita pérdidas de repuestos y materiales de motores. De esta manera, el ahorro mensual total consolidado asciende a $15500.00 MXN.</w:t>
-      </w:r>
-    </w:p>
-    <w:p>
-      <w:pPr>
-        <w:spacing w:line="360" w:lineRule="auto" w:before="0" w:after="120"/>
-        <w:ind w:left="0" w:firstLine="0"/>
-        <w:jc w:val="both"/>
-      </w:pPr>
-      <w:r>
-        <w:rPr>
-          <w:rFonts w:ascii="Arial" w:hAnsi="Arial"/>
-          <w:sz w:val="24"/>
-        </w:rPr>
-        <w:t>En segundo lugar, se analiza el periodo de recuperación de la inversión desde dos enfoques contables distintos:</w:t>
-      </w:r>
-    </w:p>
-    <w:p>
-      <w:pPr>
-        <w:spacing w:line="360" w:lineRule="auto" w:before="0" w:after="80"/>
-        <w:ind w:left="576" w:hanging="288"/>
-        <w:jc w:val="both"/>
-      </w:pPr>
-      <w:r>
-        <w:rPr>
-          <w:rFonts w:ascii="Arial" w:hAnsi="Arial"/>
-          <w:sz w:val="24"/>
-        </w:rPr>
-        <w:t xml:space="preserve">• </w:t>
-      </w:r>
-      <w:r>
-        <w:rPr>
-          <w:rFonts w:ascii="Arial" w:hAnsi="Arial"/>
-          <w:sz w:val="24"/>
-        </w:rPr>
-        <w:t>Enfoque de Inversión Teórica (Mercado): Al dividir la valoración total de la mano de obra de desarrollo ($48000.00 MXN) entre el beneficio económico mensual ($15500.00 MXN), se obtiene un periodo de recuperación de 3.09 meses, lo que equivale a aproximadamente 3 meses y 3 días de operación.</w:t>
-      </w:r>
-    </w:p>
-    <w:p>
-      <w:pPr>
-        <w:spacing w:line="360" w:lineRule="auto" w:before="0" w:after="80"/>
-        <w:ind w:left="576" w:hanging="288"/>
-        <w:jc w:val="both"/>
-      </w:pPr>
-      <w:r>
-        <w:rPr>
-          <w:rFonts w:ascii="Arial" w:hAnsi="Arial"/>
-          <w:sz w:val="24"/>
-        </w:rPr>
-        <w:t xml:space="preserve">• </w:t>
-      </w:r>
-      <w:r>
-        <w:rPr>
-          <w:rFonts w:ascii="Arial" w:hAnsi="Arial"/>
-          <w:sz w:val="24"/>
-        </w:rPr>
-        <w:t>Enfoque de Inversión Real (Flujo de Caja): Dado que el desembolso financiero real efectuado por la organización para el desarrollo de la aplicación web fue de $0.00 MXN, la amortización es inmediata (desde el primer día de uso). El beneficio neto mensual de $15500.00 MXN se consolida como ahorro directo para el área de motores desde el inicio del despliegue.</w:t>
-      </w:r>
-    </w:p>
-    <w:p>
-      <w:pPr>
-        <w:spacing w:line="360" w:lineRule="auto" w:before="0" w:after="120"/>
-        <w:ind w:left="0" w:firstLine="0"/>
-        <w:jc w:val="both"/>
-      </w:pPr>
-      <w:r>
-        <w:rPr>
-          <w:rFonts w:ascii="Arial" w:hAnsi="Arial"/>
-          <w:sz w:val="24"/>
-        </w:rPr>
-        <w:t>En tercer lugar, se evalúan los costos recurrentes de mantenimiento mensual para asegurar la viabilidad operativa a largo plazo. Estos se resumen en la Tabla 7.</w:t>
-      </w:r>
-    </w:p>
-    <w:p>
-      <w:pPr>
-        <w:spacing w:before="240" w:after="80"/>
-      </w:pPr>
-      <w:r>
-        <w:rPr>
-          <w:rFonts w:ascii="Arial" w:hAnsi="Arial"/>
-          <w:sz w:val="20"/>
-        </w:rPr>
-        <w:t>Tabla 7. Desglose de costos mensuales de mantenimiento del sistema</w:t>
-      </w:r>
-    </w:p>
-    <w:tbl>
-      <w:tblPr>
-        <w:tblStyle w:val="Tablaconcuadrcula"/>
-        <w:tblW w:type="auto" w:w="0"/>
-        <w:tblLook w:firstColumn="1" w:firstRow="1" w:lastColumn="0" w:lastRow="0" w:noHBand="0" w:noVBand="1" w:val="04A0"/>
-      </w:tblPr>
-      <w:tblGrid>
-        <w:gridCol w:w="2138"/>
-        <w:gridCol w:w="2138"/>
-        <w:gridCol w:w="2138"/>
-        <w:gridCol w:w="2138"/>
-      </w:tblGrid>
       <w:tr>
         <w:tc>
           <w:tcPr>
-            <w:tcW w:type="dxa" w:w="2880"/>
+            <w:tcW w:type="dxa" w:w="2445"/>
           </w:tcPr>
           <w:p>
             <w:pPr>
@@ -22398,13 +23085,13 @@
                 <w:b/>
                 <w:sz w:val="20"/>
               </w:rPr>
-              <w:t>Concepto de mantenimiento</w:t>
+              <w:t>Costo total de mantenimiento</w:t>
             </w:r>
           </w:p>
         </w:tc>
         <w:tc>
           <w:tcPr>
-            <w:tcW w:type="dxa" w:w="1440"/>
+            <w:tcW w:type="dxa" w:w="1334"/>
           </w:tcPr>
           <w:p>
             <w:pPr>
@@ -22417,13 +23104,13 @@
                 <w:b/>
                 <w:sz w:val="20"/>
               </w:rPr>
-              <w:t>Categoría</w:t>
+              <w:t>Operación</w:t>
             </w:r>
           </w:p>
         </w:tc>
         <w:tc>
           <w:tcPr>
-            <w:tcW w:type="dxa" w:w="4608"/>
+            <w:tcW w:type="dxa" w:w="3469"/>
           </w:tcPr>
           <w:p>
             <w:pPr>
@@ -22436,13 +23123,13 @@
                 <w:b/>
                 <w:sz w:val="20"/>
               </w:rPr>
-              <w:t>Descripción</w:t>
+              <w:t>Gasto recurrente mensual de la plataforma</w:t>
             </w:r>
           </w:p>
         </w:tc>
         <w:tc>
           <w:tcPr>
-            <w:tcW w:type="dxa" w:w="1440"/>
+            <w:tcW w:type="dxa" w:w="1296"/>
           </w:tcPr>
           <w:p>
             <w:pPr>
@@ -22455,155 +23142,7 @@
                 <w:b/>
                 <w:sz w:val="20"/>
               </w:rPr>
-              <w:t>Costo mensual (MXN)</w:t>
-            </w:r>
-          </w:p>
-        </w:tc>
-      </w:tr>
-      <w:tr>
-        <w:tc>
-          <w:tcPr>
-            <w:tcW w:type="dxa" w:w="2880"/>
-          </w:tcPr>
-          <w:p>
-            <w:pPr>
-              <w:spacing w:before="60" w:after="60"/>
-              <w:jc w:val="left"/>
-            </w:pPr>
-            <w:r>
-              <w:rPr>
-                <w:rFonts w:ascii="Arial" w:hAnsi="Arial"/>
-                <w:sz w:val="20"/>
-              </w:rPr>
-              <w:t>Servidor en la nube Supabase</w:t>
-            </w:r>
-          </w:p>
-        </w:tc>
-        <w:tc>
-          <w:tcPr>
-            <w:tcW w:type="dxa" w:w="1440"/>
-          </w:tcPr>
-          <w:p>
-            <w:pPr>
-              <w:spacing w:before="60" w:after="60"/>
-              <w:jc w:val="left"/>
-            </w:pPr>
-            <w:r>
-              <w:rPr>
-                <w:rFonts w:ascii="Arial" w:hAnsi="Arial"/>
-                <w:sz w:val="20"/>
-              </w:rPr>
-              <w:t>Nube</w:t>
-            </w:r>
-          </w:p>
-        </w:tc>
-        <w:tc>
-          <w:tcPr>
-            <w:tcW w:type="dxa" w:w="4608"/>
-          </w:tcPr>
-          <w:p>
-            <w:pPr>
-              <w:spacing w:before="60" w:after="60"/>
-              <w:jc w:val="left"/>
-            </w:pPr>
-            <w:r>
-              <w:rPr>
-                <w:rFonts w:ascii="Arial" w:hAnsi="Arial"/>
-                <w:sz w:val="20"/>
-              </w:rPr>
-              <w:t>Capa gratuita de Supabase y Vercel</w:t>
-            </w:r>
-          </w:p>
-        </w:tc>
-        <w:tc>
-          <w:tcPr>
-            <w:tcW w:type="dxa" w:w="1440"/>
-          </w:tcPr>
-          <w:p>
-            <w:pPr>
-              <w:spacing w:before="60" w:after="60"/>
-              <w:jc w:val="left"/>
-            </w:pPr>
-            <w:r>
-              <w:rPr>
-                <w:rFonts w:ascii="Arial" w:hAnsi="Arial"/>
-                <w:sz w:val="20"/>
-              </w:rPr>
-              <w:t>0.00</w:t>
-            </w:r>
-          </w:p>
-        </w:tc>
-      </w:tr>
-      <w:tr>
-        <w:tc>
-          <w:tcPr>
-            <w:tcW w:type="dxa" w:w="2880"/>
-          </w:tcPr>
-          <w:p>
-            <w:pPr>
-              <w:spacing w:before="60" w:after="60"/>
-              <w:jc w:val="left"/>
-            </w:pPr>
-            <w:r>
-              <w:rPr>
-                <w:rFonts w:ascii="Arial" w:hAnsi="Arial"/>
-                <w:sz w:val="20"/>
-              </w:rPr>
-              <w:t>Soporte técnico del sistema</w:t>
-            </w:r>
-          </w:p>
-        </w:tc>
-        <w:tc>
-          <w:tcPr>
-            <w:tcW w:type="dxa" w:w="1440"/>
-          </w:tcPr>
-          <w:p>
-            <w:pPr>
-              <w:spacing w:before="60" w:after="60"/>
-              <w:jc w:val="left"/>
-            </w:pPr>
-            <w:r>
-              <w:rPr>
-                <w:rFonts w:ascii="Arial" w:hAnsi="Arial"/>
-                <w:sz w:val="20"/>
-              </w:rPr>
-              <w:t>Mano de obra</w:t>
-            </w:r>
-          </w:p>
-        </w:tc>
-        <w:tc>
-          <w:tcPr>
-            <w:tcW w:type="dxa" w:w="4608"/>
-          </w:tcPr>
-          <w:p>
-            <w:pPr>
-              <w:spacing w:before="60" w:after="60"/>
-              <w:jc w:val="left"/>
-            </w:pPr>
-            <w:r>
-              <w:rPr>
-                <w:rFonts w:ascii="Arial" w:hAnsi="Arial"/>
-                <w:sz w:val="20"/>
-              </w:rPr>
-              <w:t>Soporte interno de tecnologías de información (2 horas estimadas a $400.00 MXN por hora)</w:t>
-            </w:r>
-          </w:p>
-        </w:tc>
-        <w:tc>
-          <w:tcPr>
-            <w:tcW w:type="dxa" w:w="1440"/>
-          </w:tcPr>
-          <w:p>
-            <w:pPr>
-              <w:spacing w:before="60" w:after="60"/>
-              <w:jc w:val="left"/>
-            </w:pPr>
-            <w:r>
-              <w:rPr>
-                <w:rFonts w:ascii="Arial" w:hAnsi="Arial"/>
-                <w:sz w:val="20"/>
-              </w:rPr>
-              <w:t>800.00</w:t>
+              <w:t>1700.00</w:t>
             </w:r>
           </w:p>
         </w:tc>
@@ -22626,21 +23165,25 @@
           <w:b/>
           <w:sz w:val="36"/>
         </w:rPr>
+        <w:lastRenderedPageBreak/>
         <w:t>Anexo A. Manual de usuario de la aplicación</w:t>
       </w:r>
     </w:p>
     <w:p>
       <w:pPr>
-        <w:spacing w:line="360" w:lineRule="auto" w:before="0" w:after="120"/>
-        <w:ind w:left="0" w:firstLine="0"/>
-        <w:jc w:val="both"/>
+        <w:spacing w:after="120"/>
       </w:pPr>
       <w:r>
         <w:rPr>
           <w:rFonts w:ascii="Arial" w:hAnsi="Arial"/>
-          <w:sz w:val="24"/>
-        </w:rPr>
-        <w:t>El manual de usuario de la aplicación web progresiva ServiControl describe el flujo secuencial de instrucciones que deben seguir los diferentes roles autorizados (administrador y técnico de campo) para interactuar con las diversas funciones integradas del sistema.</w:t>
+        </w:rPr>
+        <w:t>El manual de usuario de la aplicación web progresiva ServiControl describe el flujo secuencial de instrucciones que deben seguir los diferentes roles autorizados (administrador y técnico de campo) para interactua</w:t>
+      </w:r>
+      <w:r>
+        <w:rPr>
+          <w:rFonts w:ascii="Arial" w:hAnsi="Arial"/>
+        </w:rPr>
+        <w:t>r con las diversas funciones integradas del sistema.</w:t>
       </w:r>
     </w:p>
     <w:p>
@@ -22660,16 +23203,19 @@
     </w:p>
     <w:p>
       <w:pPr>
-        <w:spacing w:line="360" w:lineRule="auto" w:before="0" w:after="120"/>
-        <w:ind w:left="0" w:firstLine="0"/>
-        <w:jc w:val="both"/>
+        <w:spacing w:after="120"/>
       </w:pPr>
       <w:r>
         <w:rPr>
           <w:rFonts w:ascii="Arial" w:hAnsi="Arial"/>
-          <w:sz w:val="24"/>
-        </w:rPr>
-        <w:t>El usuario administrador coordina el catálogo de clientes, gestiona el inventario de almacén, asigna las órdenes de trabajo y audita el cierre de los servicios técnicos. En la Figura 30 se ilustra el esquema general de navegación del panel administrativo.</w:t>
+        </w:rPr>
+        <w:t>El usuario administrador coordina el catálogo de clientes, gestiona el inventario de almacén, asigna las órdenes de trabajo y audita el cierre de los servicios técn</w:t>
+      </w:r>
+      <w:r>
+        <w:rPr>
+          <w:rFonts w:ascii="Arial" w:hAnsi="Arial"/>
+        </w:rPr>
+        <w:t>icos. En la Figura 30 se ilustra el esquema general de navegación del panel administrativo.</w:t>
       </w:r>
     </w:p>
     <w:p>
@@ -22681,7 +23227,6 @@
       <w:r>
         <w:rPr>
           <w:rFonts w:ascii="Arial" w:hAnsi="Arial"/>
-          <w:b w:val="0"/>
           <w:sz w:val="20"/>
         </w:rPr>
         <w:t>Figura 30. Diagrama de flujo de las operaciones del Administrador.</w:t>
@@ -22689,254 +23234,198 @@
     </w:p>
     <w:p>
       <w:pPr>
-        <w:spacing w:line="360" w:lineRule="auto" w:before="0" w:after="120"/>
-        <w:ind w:left="0" w:firstLine="0"/>
-        <w:jc w:val="both"/>
+        <w:spacing w:after="120"/>
       </w:pPr>
       <w:r>
         <w:rPr>
           <w:rFonts w:ascii="Arial" w:hAnsi="Arial"/>
-          <w:sz w:val="24"/>
         </w:rPr>
         <w:t>A.1.1. Gestión de Clientes</w:t>
       </w:r>
     </w:p>
     <w:p>
       <w:pPr>
-        <w:spacing w:line="360" w:lineRule="auto" w:before="0" w:after="80"/>
+        <w:spacing w:after="80"/>
         <w:ind w:left="576" w:hanging="288"/>
-        <w:jc w:val="both"/>
       </w:pPr>
       <w:r>
         <w:rPr>
           <w:rFonts w:ascii="Arial" w:hAnsi="Arial"/>
-          <w:sz w:val="24"/>
-        </w:rPr>
-        <w:t xml:space="preserve">1. </w:t>
+        </w:rPr>
+        <w:t>1. Acceso al Catálogo: En la barra superior de navegación, se seleccio</w:t>
       </w:r>
       <w:r>
         <w:rPr>
           <w:rFonts w:ascii="Arial" w:hAnsi="Arial"/>
-          <w:sz w:val="24"/>
-        </w:rPr>
-        <w:t>Acceso al Catálogo: En la barra superior de navegación, se selecciona la opción Clientes.</w:t>
-      </w:r>
-    </w:p>
-    <w:p>
-      <w:pPr>
-        <w:spacing w:line="360" w:lineRule="auto" w:before="0" w:after="80"/>
+        </w:rPr>
+        <w:t>na la opción Clientes.</w:t>
+      </w:r>
+    </w:p>
+    <w:p>
+      <w:pPr>
+        <w:spacing w:after="80"/>
         <w:ind w:left="576" w:hanging="288"/>
-        <w:jc w:val="both"/>
       </w:pPr>
       <w:r>
         <w:rPr>
           <w:rFonts w:ascii="Arial" w:hAnsi="Arial"/>
-          <w:sz w:val="24"/>
-        </w:rPr>
-        <w:t xml:space="preserve">2. </w:t>
-      </w:r>
+        </w:rPr>
+        <w:t>2. Registro de Cliente: Se presiona el botón Nuevo Cliente. Se capturan los datos correspondientes al nombre de la empresa y el número telefónico de contacto en el formulario desplegado.</w:t>
+      </w:r>
+    </w:p>
+    <w:p>
+      <w:pPr>
+        <w:spacing w:after="80"/>
+        <w:ind w:left="576" w:hanging="288"/>
+      </w:pPr>
       <w:r>
         <w:rPr>
           <w:rFonts w:ascii="Arial" w:hAnsi="Arial"/>
-          <w:sz w:val="24"/>
-        </w:rPr>
-        <w:t>Registro de Cliente: Se presiona el botón Nuevo Cliente. Se capturan los datos correspondientes al nombre de la empresa y el número telefónico de contacto en el formulario desplegado.</w:t>
-      </w:r>
-    </w:p>
-    <w:p>
-      <w:pPr>
-        <w:spacing w:line="360" w:lineRule="auto" w:before="0" w:after="80"/>
+        </w:rPr>
+        <w:t>3. Persistencia: Se presiona el botón Guardar.</w:t>
+      </w:r>
+      <w:r>
+        <w:rPr>
+          <w:rFonts w:ascii="Arial" w:hAnsi="Arial"/>
+        </w:rPr>
+        <w:t xml:space="preserve"> El sistema inserta el registro y actualiza el listado.</w:t>
+      </w:r>
+    </w:p>
+    <w:p>
+      <w:pPr>
+        <w:spacing w:after="120"/>
+      </w:pPr>
+      <w:r>
+        <w:rPr>
+          <w:rFonts w:ascii="Arial" w:hAnsi="Arial"/>
+        </w:rPr>
+        <w:t>A.1.2. Programación de Órdenes de Servicio</w:t>
+      </w:r>
+    </w:p>
+    <w:p>
+      <w:pPr>
+        <w:spacing w:after="80"/>
         <w:ind w:left="576" w:hanging="288"/>
-        <w:jc w:val="both"/>
       </w:pPr>
       <w:r>
         <w:rPr>
           <w:rFonts w:ascii="Arial" w:hAnsi="Arial"/>
-          <w:sz w:val="24"/>
-        </w:rPr>
-        <w:t xml:space="preserve">3. </w:t>
-      </w:r>
+        </w:rPr>
+        <w:t>1. Creación de Orden: Se presiona el botón Nueva Orden en el tablero principal.</w:t>
+      </w:r>
+    </w:p>
+    <w:p>
+      <w:pPr>
+        <w:spacing w:after="80"/>
+        <w:ind w:left="576" w:hanging="288"/>
+      </w:pPr>
       <w:r>
         <w:rPr>
           <w:rFonts w:ascii="Arial" w:hAnsi="Arial"/>
-          <w:sz w:val="24"/>
-        </w:rPr>
-        <w:t>Persistencia: Se presiona el botón Guardar. El sistema inserta el registro y actualiza el listado.</w:t>
-      </w:r>
-    </w:p>
-    <w:p>
-      <w:pPr>
-        <w:spacing w:line="360" w:lineRule="auto" w:before="0" w:after="120"/>
-        <w:ind w:left="0" w:firstLine="0"/>
-        <w:jc w:val="both"/>
-      </w:pPr>
+        </w:rPr>
+        <w:t>2. Llenado de Datos: Se selecciona el cliente creado y el técnico responsable</w:t>
+      </w:r>
       <w:r>
         <w:rPr>
           <w:rFonts w:ascii="Arial" w:hAnsi="Arial"/>
-          <w:sz w:val="24"/>
-        </w:rPr>
-        <w:t>A.1.2. Programación de Órdenes de Servicio</w:t>
-      </w:r>
-    </w:p>
-    <w:p>
-      <w:pPr>
-        <w:spacing w:line="360" w:lineRule="auto" w:before="0" w:after="80"/>
+        </w:rPr>
+        <w:t xml:space="preserve"> de las listas desplegables. Se establece la fecha y hora de atención del servicio.</w:t>
+      </w:r>
+    </w:p>
+    <w:p>
+      <w:pPr>
+        <w:spacing w:after="80"/>
         <w:ind w:left="576" w:hanging="288"/>
-        <w:jc w:val="both"/>
       </w:pPr>
       <w:r>
         <w:rPr>
           <w:rFonts w:ascii="Arial" w:hAnsi="Arial"/>
-          <w:sz w:val="24"/>
-        </w:rPr>
-        <w:t xml:space="preserve">1. </w:t>
+        </w:rPr>
+        <w:lastRenderedPageBreak/>
+        <w:t>3. Georreferenciación Objetivo: En el mapa interactivo incorporado, se desplaza el cursor y se hace clic en la ubicación física exacta del cliente. El sistema carga la dire</w:t>
       </w:r>
       <w:r>
         <w:rPr>
           <w:rFonts w:ascii="Arial" w:hAnsi="Arial"/>
-          <w:sz w:val="24"/>
-        </w:rPr>
-        <w:t>Creación de Orden: Se presiona el botón Nueva Orden en el tablero principal.</w:t>
-      </w:r>
-    </w:p>
-    <w:p>
-      <w:pPr>
-        <w:spacing w:line="360" w:lineRule="auto" w:before="0" w:after="80"/>
+        </w:rPr>
+        <w:t>cción postal correspondiente de forma automática.</w:t>
+      </w:r>
+    </w:p>
+    <w:p>
+      <w:pPr>
+        <w:spacing w:after="80"/>
         <w:ind w:left="576" w:hanging="288"/>
-        <w:jc w:val="both"/>
       </w:pPr>
       <w:r>
         <w:rPr>
           <w:rFonts w:ascii="Arial" w:hAnsi="Arial"/>
-          <w:sz w:val="24"/>
-        </w:rPr>
-        <w:t xml:space="preserve">2. </w:t>
-      </w:r>
+        </w:rPr>
+        <w:t>4. Guardado: Se presiona el botón Guardar. La orden cambia al estado Asignada y aparece en el tablero del técnico.</w:t>
+      </w:r>
+    </w:p>
+    <w:p>
+      <w:pPr>
+        <w:spacing w:after="120"/>
+      </w:pPr>
       <w:r>
         <w:rPr>
           <w:rFonts w:ascii="Arial" w:hAnsi="Arial"/>
-          <w:sz w:val="24"/>
-        </w:rPr>
-        <w:t>Llenado de Datos: Se selecciona el cliente creado y el técnico responsable de las listas desplegables. Se establece la fecha y hora de atención del servicio.</w:t>
-      </w:r>
-    </w:p>
-    <w:p>
-      <w:pPr>
-        <w:spacing w:line="360" w:lineRule="auto" w:before="0" w:after="80"/>
+        </w:rPr>
+        <w:t>A.1.3. Auditoría e Inspección de Servicios</w:t>
+      </w:r>
+    </w:p>
+    <w:p>
+      <w:pPr>
+        <w:spacing w:after="80"/>
         <w:ind w:left="576" w:hanging="288"/>
-        <w:jc w:val="both"/>
       </w:pPr>
       <w:r>
         <w:rPr>
           <w:rFonts w:ascii="Arial" w:hAnsi="Arial"/>
-          <w:sz w:val="24"/>
-        </w:rPr>
-        <w:t xml:space="preserve">3. </w:t>
+        </w:rPr>
+        <w:t xml:space="preserve">1. Selección de Expediente: En la sección de </w:t>
       </w:r>
       <w:r>
         <w:rPr>
           <w:rFonts w:ascii="Arial" w:hAnsi="Arial"/>
-          <w:sz w:val="24"/>
-        </w:rPr>
-        <w:t>Georreferenciación Objetivo: En el mapa interactivo incorporado, se desplaza el cursor y se hace clic en la ubicación física exacta del cliente. El sistema carga la dirección postal correspondiente de forma automática.</w:t>
-      </w:r>
-    </w:p>
-    <w:p>
-      <w:pPr>
-        <w:spacing w:line="360" w:lineRule="auto" w:before="0" w:after="80"/>
+        </w:rPr>
+        <w:t>órdenes completadas del tablero de control, se presiona el botón Detalles sobre la orden deseada.</w:t>
+      </w:r>
+    </w:p>
+    <w:p>
+      <w:pPr>
+        <w:spacing w:after="80"/>
         <w:ind w:left="576" w:hanging="288"/>
-        <w:jc w:val="both"/>
       </w:pPr>
       <w:r>
         <w:rPr>
           <w:rFonts w:ascii="Arial" w:hAnsi="Arial"/>
-          <w:sz w:val="24"/>
-        </w:rPr>
-        <w:t xml:space="preserve">4. </w:t>
+        </w:rPr>
+        <w:t>2. Inspección Visual y de Evidencia: El sistema despliega un modal con la información de la orden, los comentarios del técnico y la fotografía de evidencia ca</w:t>
       </w:r>
       <w:r>
         <w:rPr>
           <w:rFonts w:ascii="Arial" w:hAnsi="Arial"/>
-          <w:sz w:val="24"/>
-        </w:rPr>
-        <w:t>Guardado: Se presiona el botón Guardar. La orden cambia al estado Asignada y aparece en el tablero del técnico.</w:t>
-      </w:r>
-    </w:p>
-    <w:p>
-      <w:pPr>
-        <w:spacing w:line="360" w:lineRule="auto" w:before="0" w:after="120"/>
-        <w:ind w:left="0" w:firstLine="0"/>
-        <w:jc w:val="both"/>
+        </w:rPr>
+        <w:t>rgada.</w:t>
+      </w:r>
+    </w:p>
+    <w:p>
+      <w:pPr>
+        <w:spacing w:after="80"/>
+        <w:ind w:left="576" w:hanging="288"/>
       </w:pPr>
       <w:r>
         <w:rPr>
           <w:rFonts w:ascii="Arial" w:hAnsi="Arial"/>
-          <w:sz w:val="24"/>
-        </w:rPr>
-        <w:t>A.1.3. Auditoría e Inspección de Servicios</w:t>
-      </w:r>
-    </w:p>
-    <w:p>
-      <w:pPr>
-        <w:spacing w:line="360" w:lineRule="auto" w:before="0" w:after="80"/>
-        <w:ind w:left="576" w:hanging="288"/>
-        <w:jc w:val="both"/>
-      </w:pPr>
+        </w:rPr>
+        <w:t>3. Comparación Geográfica: En el mapa inferior se visualizan dos marcadores: el marcador azul (ubicación objetivo del cliente) y el marcador verde (coordenada GPS capturada por el técnico en sitio al iniciar o cerrar el trabajo), permitiendo verific</w:t>
+      </w:r>
       <w:r>
         <w:rPr>
           <w:rFonts w:ascii="Arial" w:hAnsi="Arial"/>
-          <w:sz w:val="24"/>
-        </w:rPr>
-        <w:t xml:space="preserve">1. </w:t>
-      </w:r>
-      <w:r>
-        <w:rPr>
-          <w:rFonts w:ascii="Arial" w:hAnsi="Arial"/>
-          <w:sz w:val="24"/>
-        </w:rPr>
-        <w:t>Selección de Expediente: En la sección de órdenes completadas del tablero de control, se presiona el botón Detalles sobre la orden deseada.</w:t>
-      </w:r>
-    </w:p>
-    <w:p>
-      <w:pPr>
-        <w:spacing w:line="360" w:lineRule="auto" w:before="0" w:after="80"/>
-        <w:ind w:left="576" w:hanging="288"/>
-        <w:jc w:val="both"/>
-      </w:pPr>
-      <w:r>
-        <w:rPr>
-          <w:rFonts w:ascii="Arial" w:hAnsi="Arial"/>
-          <w:sz w:val="24"/>
-        </w:rPr>
-        <w:t xml:space="preserve">2. </w:t>
-      </w:r>
-      <w:r>
-        <w:rPr>
-          <w:rFonts w:ascii="Arial" w:hAnsi="Arial"/>
-          <w:sz w:val="24"/>
-        </w:rPr>
-        <w:t>Inspección Visual y de Evidencia: El sistema despliega un modal con la información de la orden, los comentarios del técnico y la fotografía de evidencia cargada.</w:t>
-      </w:r>
-    </w:p>
-    <w:p>
-      <w:pPr>
-        <w:spacing w:line="360" w:lineRule="auto" w:before="0" w:after="80"/>
-        <w:ind w:left="576" w:hanging="288"/>
-        <w:jc w:val="both"/>
-      </w:pPr>
-      <w:r>
-        <w:rPr>
-          <w:rFonts w:ascii="Arial" w:hAnsi="Arial"/>
-          <w:sz w:val="24"/>
-        </w:rPr>
-        <w:t xml:space="preserve">3. </w:t>
-      </w:r>
-      <w:r>
-        <w:rPr>
-          <w:rFonts w:ascii="Arial" w:hAnsi="Arial"/>
-          <w:sz w:val="24"/>
-        </w:rPr>
-        <w:t>Comparación Geográfica: En el mapa inferior se visualizan dos marcadores: el marcador azul (ubicación objetivo del cliente) y el marcador verde (coordenada GPS capturada por el técnico en sitio al iniciar o cerrar el trabajo), permitiendo verificar la ejecución real.</w:t>
+        </w:rPr>
+        <w:t>ar la ejecución real.</w:t>
       </w:r>
     </w:p>
     <w:p>
@@ -22956,16 +23445,19 @@
     </w:p>
     <w:p>
       <w:pPr>
-        <w:spacing w:line="360" w:lineRule="auto" w:before="0" w:after="120"/>
-        <w:ind w:left="0" w:firstLine="0"/>
-        <w:jc w:val="both"/>
+        <w:spacing w:after="120"/>
       </w:pPr>
       <w:r>
         <w:rPr>
           <w:rFonts w:ascii="Arial" w:hAnsi="Arial"/>
-          <w:sz w:val="24"/>
-        </w:rPr>
-        <w:t>El técnico de campo ejecuta las actividades de reparación y mantenimiento, reporta los materiales utilizados y documenta el cierre del servicio desde su terminal móvil. En la Figura 31 se muestra el esquema del flujo del técnico.</w:t>
+        </w:rPr>
+        <w:t>El técnico de campo ejecuta las actividades de reparación y mantenimiento, reporta los materiales utilizados y documenta el cierre del servicio desde su terminal móvil. En la Figura 31 se mues</w:t>
+      </w:r>
+      <w:r>
+        <w:rPr>
+          <w:rFonts w:ascii="Arial" w:hAnsi="Arial"/>
+        </w:rPr>
+        <w:t>tra el esquema del flujo del técnico.</w:t>
       </w:r>
     </w:p>
     <w:p>
@@ -22977,7 +23469,6 @@
       <w:r>
         <w:rPr>
           <w:rFonts w:ascii="Arial" w:hAnsi="Arial"/>
-          <w:b w:val="0"/>
           <w:sz w:val="20"/>
         </w:rPr>
         <w:t>Figura 31. Diagrama de flujo de las operaciones del Técnico de Campo.</w:t>
@@ -22985,268 +23476,215 @@
     </w:p>
     <w:p>
       <w:pPr>
-        <w:spacing w:line="360" w:lineRule="auto" w:before="0" w:after="120"/>
-        <w:ind w:left="0" w:firstLine="0"/>
-        <w:jc w:val="both"/>
+        <w:spacing w:after="120"/>
       </w:pPr>
       <w:r>
         <w:rPr>
           <w:rFonts w:ascii="Arial" w:hAnsi="Arial"/>
-          <w:sz w:val="24"/>
         </w:rPr>
         <w:t>A.2.1. Consulta del Tablero en Modo Conectado u Offline</w:t>
       </w:r>
     </w:p>
     <w:p>
       <w:pPr>
-        <w:spacing w:line="360" w:lineRule="auto" w:before="0" w:after="80"/>
+        <w:spacing w:after="80"/>
         <w:ind w:left="576" w:hanging="288"/>
-        <w:jc w:val="both"/>
       </w:pPr>
       <w:r>
         <w:rPr>
           <w:rFonts w:ascii="Arial" w:hAnsi="Arial"/>
-          <w:sz w:val="24"/>
-        </w:rPr>
-        <w:t xml:space="preserve">1. </w:t>
+        </w:rPr>
+        <w:t>1. Visualización de Servicios: Al acceder a la aplicación en la ruta /tech, el sistema prese</w:t>
       </w:r>
       <w:r>
         <w:rPr>
           <w:rFonts w:ascii="Arial" w:hAnsi="Arial"/>
-          <w:sz w:val="24"/>
-        </w:rPr>
-        <w:t>Visualización de Servicios: Al acceder a la aplicación en la ruta /tech, el sistema presenta el listado de órdenes asignadas.</w:t>
-      </w:r>
-    </w:p>
-    <w:p>
-      <w:pPr>
-        <w:spacing w:line="360" w:lineRule="auto" w:before="0" w:after="80"/>
+        </w:rPr>
+        <w:t>nta el listado de órdenes asignadas.</w:t>
+      </w:r>
+    </w:p>
+    <w:p>
+      <w:pPr>
+        <w:spacing w:after="80"/>
         <w:ind w:left="576" w:hanging="288"/>
-        <w:jc w:val="both"/>
       </w:pPr>
       <w:r>
         <w:rPr>
           <w:rFonts w:ascii="Arial" w:hAnsi="Arial"/>
-          <w:sz w:val="24"/>
-        </w:rPr>
-        <w:t xml:space="preserve">2. </w:t>
-      </w:r>
+        </w:rPr>
+        <w:t>2. Sincronización en Caché: Si se cuenta con acceso a internet, el sistema actualiza los registros y guarda una copia local en la caché del navegador.</w:t>
+      </w:r>
+    </w:p>
+    <w:p>
+      <w:pPr>
+        <w:spacing w:after="80"/>
+        <w:ind w:left="576" w:hanging="288"/>
+      </w:pPr>
       <w:r>
         <w:rPr>
           <w:rFonts w:ascii="Arial" w:hAnsi="Arial"/>
-          <w:sz w:val="24"/>
-        </w:rPr>
-        <w:t>Sincronización en Caché: Si se cuenta con acceso a internet, el sistema actualiza los registros y guarda una copia local en la caché del navegador.</w:t>
-      </w:r>
-    </w:p>
-    <w:p>
-      <w:pPr>
-        <w:spacing w:line="360" w:lineRule="auto" w:before="0" w:after="80"/>
+        </w:rPr>
+        <w:t>3. Operación sin Red: Si el dispositivo pierde la señal de red, el s</w:t>
+      </w:r>
+      <w:r>
+        <w:rPr>
+          <w:rFonts w:ascii="Arial" w:hAnsi="Arial"/>
+        </w:rPr>
+        <w:t xml:space="preserve">istema carga los datos guardados en la memoria caché local y despliega un banner </w:t>
+      </w:r>
+      <w:r>
+        <w:rPr>
+          <w:rFonts w:ascii="Arial" w:hAnsi="Arial"/>
+        </w:rPr>
+        <w:lastRenderedPageBreak/>
+        <w:t>ámbar indicando el modo sin conexión. El técnico visualiza sus tareas sin interrupciones.</w:t>
+      </w:r>
+    </w:p>
+    <w:p>
+      <w:pPr>
+        <w:spacing w:after="120"/>
+      </w:pPr>
+      <w:r>
+        <w:rPr>
+          <w:rFonts w:ascii="Arial" w:hAnsi="Arial"/>
+        </w:rPr>
+        <w:t>A.2.2. Inicio de la Intervención Técnica</w:t>
+      </w:r>
+    </w:p>
+    <w:p>
+      <w:pPr>
+        <w:spacing w:after="80"/>
         <w:ind w:left="576" w:hanging="288"/>
-        <w:jc w:val="both"/>
       </w:pPr>
       <w:r>
         <w:rPr>
           <w:rFonts w:ascii="Arial" w:hAnsi="Arial"/>
-          <w:sz w:val="24"/>
-        </w:rPr>
-        <w:t xml:space="preserve">3. </w:t>
+        </w:rPr>
+        <w:t>1. Apertura de Orden: Se presiona sobre la t</w:t>
       </w:r>
       <w:r>
         <w:rPr>
           <w:rFonts w:ascii="Arial" w:hAnsi="Arial"/>
-          <w:sz w:val="24"/>
-        </w:rPr>
-        <w:t>Operación sin Red: Si el dispositivo pierde la señal de red, el sistema carga los datos guardados en la memoria caché local y despliega un banner ámbar indicando el modo sin conexión. El técnico visualiza sus tareas sin interrupciones.</w:t>
-      </w:r>
-    </w:p>
-    <w:p>
-      <w:pPr>
-        <w:spacing w:line="360" w:lineRule="auto" w:before="0" w:after="120"/>
-        <w:ind w:left="0" w:firstLine="0"/>
-        <w:jc w:val="both"/>
+        </w:rPr>
+        <w:t>arjeta del servicio asignado para abrir el expediente detallado.</w:t>
+      </w:r>
+    </w:p>
+    <w:p>
+      <w:pPr>
+        <w:spacing w:after="80"/>
+        <w:ind w:left="576" w:hanging="288"/>
       </w:pPr>
       <w:r>
         <w:rPr>
           <w:rFonts w:ascii="Arial" w:hAnsi="Arial"/>
-          <w:sz w:val="24"/>
-        </w:rPr>
-        <w:t>A.2.2. Inicio de la Intervención Técnica</w:t>
-      </w:r>
-    </w:p>
-    <w:p>
-      <w:pPr>
-        <w:spacing w:line="360" w:lineRule="auto" w:before="0" w:after="80"/>
+        </w:rPr>
+        <w:t xml:space="preserve">2. Inicio del Trabajo: Se presiona el botón Iniciar Servicio. El estado de la orden cambia a En progreso y el navegador registra automáticamente las coordenadas de </w:t>
+      </w:r>
+      <w:r>
+        <w:rPr>
+          <w:rFonts w:ascii="Arial" w:hAnsi="Arial"/>
+        </w:rPr>
+        <w:t>geolocalización iniciales.</w:t>
+      </w:r>
+    </w:p>
+    <w:p>
+      <w:pPr>
+        <w:spacing w:after="120"/>
+      </w:pPr>
+      <w:r>
+        <w:rPr>
+          <w:rFonts w:ascii="Arial" w:hAnsi="Arial"/>
+        </w:rPr>
+        <w:t>A.2.3. Registro de Consumos de Materiales e Insumos</w:t>
+      </w:r>
+    </w:p>
+    <w:p>
+      <w:pPr>
+        <w:spacing w:after="80"/>
         <w:ind w:left="576" w:hanging="288"/>
-        <w:jc w:val="both"/>
       </w:pPr>
       <w:r>
         <w:rPr>
           <w:rFonts w:ascii="Arial" w:hAnsi="Arial"/>
-          <w:sz w:val="24"/>
-        </w:rPr>
-        <w:t xml:space="preserve">1. </w:t>
-      </w:r>
+        </w:rPr>
+        <w:t>1. Adición de Materiales: En el panel de insumos, se selecciona el repuesto utilizado del catálogo.</w:t>
+      </w:r>
+    </w:p>
+    <w:p>
+      <w:pPr>
+        <w:spacing w:after="80"/>
+        <w:ind w:left="576" w:hanging="288"/>
+      </w:pPr>
       <w:r>
         <w:rPr>
           <w:rFonts w:ascii="Arial" w:hAnsi="Arial"/>
-          <w:sz w:val="24"/>
-        </w:rPr>
-        <w:t>Apertura de Orden: Se presiona sobre la tarjeta del servicio asignado para abrir el expediente detallado.</w:t>
-      </w:r>
-    </w:p>
-    <w:p>
-      <w:pPr>
-        <w:spacing w:line="360" w:lineRule="auto" w:before="0" w:after="80"/>
+        </w:rPr>
+        <w:t>2. Selección de Cantidad: Se ingresa el número de unidades consumidas y se pr</w:t>
+      </w:r>
+      <w:r>
+        <w:rPr>
+          <w:rFonts w:ascii="Arial" w:hAnsi="Arial"/>
+        </w:rPr>
+        <w:t>esiona el botón Registrar. El sistema descuenta de forma síncrona el stock y actualiza la lista.</w:t>
+      </w:r>
+    </w:p>
+    <w:p>
+      <w:pPr>
+        <w:spacing w:after="120"/>
+      </w:pPr>
+      <w:r>
+        <w:rPr>
+          <w:rFonts w:ascii="Arial" w:hAnsi="Arial"/>
+        </w:rPr>
+        <w:t>A.2.4. Cierre del Expediente y Carga de Evidencia</w:t>
+      </w:r>
+    </w:p>
+    <w:p>
+      <w:pPr>
+        <w:spacing w:after="80"/>
         <w:ind w:left="576" w:hanging="288"/>
-        <w:jc w:val="both"/>
       </w:pPr>
       <w:r>
         <w:rPr>
           <w:rFonts w:ascii="Arial" w:hAnsi="Arial"/>
-          <w:sz w:val="24"/>
-        </w:rPr>
-        <w:t xml:space="preserve">2. </w:t>
+        </w:rPr>
+        <w:t>1. Captura Fotográfica: En la sección de evidencias, se presiona el botón Tomar / Subir Foto. Se selecciona l</w:t>
       </w:r>
       <w:r>
         <w:rPr>
           <w:rFonts w:ascii="Arial" w:hAnsi="Arial"/>
-          <w:sz w:val="24"/>
-        </w:rPr>
-        <w:t>Inicio del Trabajo: Se presiona el botón Iniciar Servicio. El estado de la orden cambia a En progreso y el navegador registra automáticamente las coordenadas de geolocalización iniciales.</w:t>
-      </w:r>
-    </w:p>
-    <w:p>
-      <w:pPr>
-        <w:spacing w:line="360" w:lineRule="auto" w:before="0" w:after="120"/>
-        <w:ind w:left="0" w:firstLine="0"/>
-        <w:jc w:val="both"/>
+        </w:rPr>
+        <w:t>a cámara del dispositivo móvil para tomar la foto o se elige un archivo de la galería. El sistema reduce de forma automática el archivo a 240 KB e inicia la subida.</w:t>
+      </w:r>
+    </w:p>
+    <w:p>
+      <w:pPr>
+        <w:spacing w:after="80"/>
+        <w:ind w:left="576" w:hanging="288"/>
       </w:pPr>
       <w:r>
         <w:rPr>
           <w:rFonts w:ascii="Arial" w:hAnsi="Arial"/>
-          <w:sz w:val="24"/>
-        </w:rPr>
-        <w:t>A.2.3. Registro de Consumos de Materiales e Insumos</w:t>
-      </w:r>
-    </w:p>
-    <w:p>
-      <w:pPr>
-        <w:spacing w:line="360" w:lineRule="auto" w:before="0" w:after="80"/>
+        </w:rPr>
+        <w:t>2. Observaciones: En el campo de comentarios, se redactan los detalles técnicos del trabajo</w:t>
+      </w:r>
+      <w:r>
+        <w:rPr>
+          <w:rFonts w:ascii="Arial" w:hAnsi="Arial"/>
+        </w:rPr>
+        <w:t xml:space="preserve"> finalizado.</w:t>
+      </w:r>
+    </w:p>
+    <w:p>
+      <w:pPr>
+        <w:spacing w:after="80"/>
         <w:ind w:left="576" w:hanging="288"/>
-        <w:jc w:val="both"/>
       </w:pPr>
       <w:r>
         <w:rPr>
           <w:rFonts w:ascii="Arial" w:hAnsi="Arial"/>
-          <w:sz w:val="24"/>
-        </w:rPr>
-        <w:t xml:space="preserve">1. </w:t>
-      </w:r>
-      <w:r>
-        <w:rPr>
-          <w:rFonts w:ascii="Arial" w:hAnsi="Arial"/>
-          <w:sz w:val="24"/>
-        </w:rPr>
-        <w:t>Adición de Materiales: En el panel de insumos, se selecciona el repuesto utilizado del catálogo.</w:t>
-      </w:r>
-    </w:p>
-    <w:p>
-      <w:pPr>
-        <w:spacing w:line="360" w:lineRule="auto" w:before="0" w:after="80"/>
-        <w:ind w:left="576" w:hanging="288"/>
-        <w:jc w:val="both"/>
-      </w:pPr>
-      <w:r>
-        <w:rPr>
-          <w:rFonts w:ascii="Arial" w:hAnsi="Arial"/>
-          <w:sz w:val="24"/>
-        </w:rPr>
-        <w:t xml:space="preserve">2. </w:t>
-      </w:r>
-      <w:r>
-        <w:rPr>
-          <w:rFonts w:ascii="Arial" w:hAnsi="Arial"/>
-          <w:sz w:val="24"/>
-        </w:rPr>
-        <w:t>Selección de Cantidad: Se ingresa el número de unidades consumidas y se presiona el botón Registrar. El sistema descuenta de forma síncrona el stock y actualiza la lista.</w:t>
-      </w:r>
-    </w:p>
-    <w:p>
-      <w:pPr>
-        <w:spacing w:line="360" w:lineRule="auto" w:before="0" w:after="120"/>
-        <w:ind w:left="0" w:firstLine="0"/>
-        <w:jc w:val="both"/>
-      </w:pPr>
-      <w:r>
-        <w:rPr>
-          <w:rFonts w:ascii="Arial" w:hAnsi="Arial"/>
-          <w:sz w:val="24"/>
-        </w:rPr>
-        <w:t>A.2.4. Cierre del Expediente y Carga de Evidencia</w:t>
-      </w:r>
-    </w:p>
-    <w:p>
-      <w:pPr>
-        <w:spacing w:line="360" w:lineRule="auto" w:before="0" w:after="80"/>
-        <w:ind w:left="576" w:hanging="288"/>
-        <w:jc w:val="both"/>
-      </w:pPr>
-      <w:r>
-        <w:rPr>
-          <w:rFonts w:ascii="Arial" w:hAnsi="Arial"/>
-          <w:sz w:val="24"/>
-        </w:rPr>
-        <w:t xml:space="preserve">1. </w:t>
-      </w:r>
-      <w:r>
-        <w:rPr>
-          <w:rFonts w:ascii="Arial" w:hAnsi="Arial"/>
-          <w:sz w:val="24"/>
-        </w:rPr>
-        <w:t>Captura Fotográfica: En la sección de evidencias, se presiona el botón Tomar / Subir Foto. Se selecciona la cámara del dispositivo móvil para tomar la foto o se elige un archivo de la galería. El sistema reduce de forma automática el archivo a 240 KB e inicia la subida.</w:t>
-      </w:r>
-    </w:p>
-    <w:p>
-      <w:pPr>
-        <w:spacing w:line="360" w:lineRule="auto" w:before="0" w:after="80"/>
-        <w:ind w:left="576" w:hanging="288"/>
-        <w:jc w:val="both"/>
-      </w:pPr>
-      <w:r>
-        <w:rPr>
-          <w:rFonts w:ascii="Arial" w:hAnsi="Arial"/>
-          <w:sz w:val="24"/>
-        </w:rPr>
-        <w:t xml:space="preserve">2. </w:t>
-      </w:r>
-      <w:r>
-        <w:rPr>
-          <w:rFonts w:ascii="Arial" w:hAnsi="Arial"/>
-          <w:sz w:val="24"/>
-        </w:rPr>
-        <w:t>Observaciones: En el campo de comentarios, se redactan los detalles técnicos del trabajo finalizado.</w:t>
-      </w:r>
-    </w:p>
-    <w:p>
-      <w:pPr>
-        <w:spacing w:line="360" w:lineRule="auto" w:before="0" w:after="80"/>
-        <w:ind w:left="576" w:hanging="288"/>
-        <w:jc w:val="both"/>
-      </w:pPr>
-      <w:r>
-        <w:rPr>
-          <w:rFonts w:ascii="Arial" w:hAnsi="Arial"/>
-          <w:sz w:val="24"/>
-        </w:rPr>
-        <w:t xml:space="preserve">3. </w:t>
-      </w:r>
-      <w:r>
-        <w:rPr>
-          <w:rFonts w:ascii="Arial" w:hAnsi="Arial"/>
-          <w:sz w:val="24"/>
-        </w:rPr>
-        <w:t>Cierre de Orden: Se presiona el botón Completar Servicio. El sistema verifica que la foto y las observaciones estén completas, valida la geolocalización final de cierre y cambia el estado de la orden a Completada, finalizando el proceso.</w:t>
+        </w:rPr>
+        <w:t>3. Cierre de Orden: Se presiona el botón Completar Servicio. El sistema verifica que la foto y las observaciones estén completas, valida la geolocalización final de cierre y cambia el estado de la orden a Completada, finalizando el proceso.</w:t>
       </w:r>
     </w:p>
     <w:sectPr>
@@ -23387,10 +23825,7 @@
         <w:annotationRef/>
       </w:r>
       <w:r>
-        <w:t xml:space="preserve">Hay que explicarla antes de incluirla. En el cuerpo del texto explicas </w:t>
-      </w:r>
-      <w:r>
-        <w:t>como funciona esto, en la figura 1 se muestra un esquema de la arquitectura cliente-servidor.</w:t>
+        <w:t>Hay que explicarla antes de incluirla. En el cuerpo del texto explicas como funciona esto, en la figura 1 se muestra un esquema de la arquitectura cliente-servidor.</w:t>
       </w:r>
     </w:p>
   </w:comment>
@@ -26763,15 +27198,6 @@
 </file>
 
 <file path=customXml/item1.xml><?xml version="1.0" encoding="utf-8"?>
-<?mso-contentType ?>
-<FormTemplates xmlns="http://schemas.microsoft.com/sharepoint/v3/contenttype/forms">
-  <Display>DocumentLibraryForm</Display>
-  <Edit>DocumentLibraryForm</Edit>
-  <New>DocumentLibraryForm</New>
-</FormTemplates>
-</file>
-
-<file path=customXml/item2.xml><?xml version="1.0" encoding="utf-8"?>
 <ct:contentTypeSchema xmlns:ct="http://schemas.microsoft.com/office/2006/metadata/contentType" xmlns:ma="http://schemas.microsoft.com/office/2006/metadata/properties/metaAttributes" ct:_="" ma:_="" ma:contentTypeName="Document" ma:contentTypeID="0x010100DB44A644FFB3D645B67AA77947D95E57" ma:contentTypeVersion="3" ma:contentTypeDescription="Create a new document." ma:contentTypeScope="" ma:versionID="824f9e65a32e55e3c61aa95e98d27f96">
   <xsd:schema xmlns:xsd="http://www.w3.org/2001/XMLSchema" xmlns:xs="http://www.w3.org/2001/XMLSchema" xmlns:p="http://schemas.microsoft.com/office/2006/metadata/properties" xmlns:ns2="c9a41bd4-3342-4308-8d8c-a81403e25f10" targetNamespace="http://schemas.microsoft.com/office/2006/metadata/properties" ma:root="true" ma:fieldsID="ff802a7858248f5f80ee5f80045f9534" ns2:_="">
     <xsd:import namespace="c9a41bd4-3342-4308-8d8c-a81403e25f10"/>
@@ -26909,25 +27335,26 @@
 </ct:contentTypeSchema>
 </file>
 
+<file path=customXml/item2.xml><?xml version="1.0" encoding="utf-8"?>
+<?mso-contentType ?>
+<FormTemplates xmlns="http://schemas.microsoft.com/sharepoint/v3/contenttype/forms">
+  <Display>DocumentLibraryForm</Display>
+  <Edit>DocumentLibraryForm</Edit>
+  <New>DocumentLibraryForm</New>
+</FormTemplates>
+</file>
+
 <file path=customXml/item3.xml><?xml version="1.0" encoding="utf-8"?>
+<b:Sources xmlns:b="http://schemas.openxmlformats.org/officeDocument/2006/bibliography" xmlns="http://schemas.openxmlformats.org/officeDocument/2006/bibliography" SelectedStyle="\APASixthEditionOfficeOnline.xsl" StyleName="APA" Version="6"/>
+</file>
+
+<file path=customXml/item4.xml><?xml version="1.0" encoding="utf-8"?>
 <p:properties xmlns:p="http://schemas.microsoft.com/office/2006/metadata/properties" xmlns:xsi="http://www.w3.org/2001/XMLSchema-instance" xmlns:pc="http://schemas.microsoft.com/office/infopath/2007/PartnerControls">
   <documentManagement/>
 </p:properties>
 </file>
 
-<file path=customXml/item4.xml><?xml version="1.0" encoding="utf-8"?>
-<b:Sources xmlns:b="http://schemas.openxmlformats.org/officeDocument/2006/bibliography" xmlns="http://schemas.openxmlformats.org/officeDocument/2006/bibliography" SelectedStyle="\APASixthEditionOfficeOnline.xsl" StyleName="APA" Version="6"/>
-</file>
-
 <file path=customXml/itemProps1.xml><?xml version="1.0" encoding="utf-8"?>
-<ds:datastoreItem xmlns:ds="http://schemas.openxmlformats.org/officeDocument/2006/customXml" ds:itemID="{046B7D6D-E179-42A3-9576-DF9EBF7715C1}">
-  <ds:schemaRefs>
-    <ds:schemaRef ds:uri="http://schemas.microsoft.com/sharepoint/v3/contenttype/forms"/>
-  </ds:schemaRefs>
-</ds:datastoreItem>
-</file>
-
-<file path=customXml/itemProps2.xml><?xml version="1.0" encoding="utf-8"?>
 <ds:datastoreItem xmlns:ds="http://schemas.openxmlformats.org/officeDocument/2006/customXml" ds:itemID="{73191520-D5FC-4CEE-B423-98D49CFE5F85}">
   <ds:schemaRefs>
     <ds:schemaRef ds:uri="http://schemas.microsoft.com/office/2006/metadata/contentType"/>
@@ -26945,19 +27372,27 @@
 </ds:datastoreItem>
 </file>
 
+<file path=customXml/itemProps2.xml><?xml version="1.0" encoding="utf-8"?>
+<ds:datastoreItem xmlns:ds="http://schemas.openxmlformats.org/officeDocument/2006/customXml" ds:itemID="{046B7D6D-E179-42A3-9576-DF9EBF7715C1}">
+  <ds:schemaRefs>
+    <ds:schemaRef ds:uri="http://schemas.microsoft.com/sharepoint/v3/contenttype/forms"/>
+  </ds:schemaRefs>
+</ds:datastoreItem>
+</file>
+
 <file path=customXml/itemProps3.xml><?xml version="1.0" encoding="utf-8"?>
+<ds:datastoreItem xmlns:ds="http://schemas.openxmlformats.org/officeDocument/2006/customXml" ds:itemID="{61C1B53D-B25B-4467-ABBC-0D26244BF9A8}">
+  <ds:schemaRefs>
+    <ds:schemaRef ds:uri="http://schemas.openxmlformats.org/officeDocument/2006/bibliography"/>
+  </ds:schemaRefs>
+</ds:datastoreItem>
+</file>
+
+<file path=customXml/itemProps4.xml><?xml version="1.0" encoding="utf-8"?>
 <ds:datastoreItem xmlns:ds="http://schemas.openxmlformats.org/officeDocument/2006/customXml" ds:itemID="{7504BB3C-81D6-44B0-887A-E6EEA91B0688}">
   <ds:schemaRefs>
     <ds:schemaRef ds:uri="http://schemas.microsoft.com/office/2006/metadata/properties"/>
     <ds:schemaRef ds:uri="http://schemas.microsoft.com/office/infopath/2007/PartnerControls"/>
   </ds:schemaRefs>
 </ds:datastoreItem>
-</file>
-
-<file path=customXml/itemProps4.xml><?xml version="1.0" encoding="utf-8"?>
-<ds:datastoreItem xmlns:ds="http://schemas.openxmlformats.org/officeDocument/2006/customXml" ds:itemID="{61C1B53D-B25B-4467-ABBC-0D26244BF9A8}">
-  <ds:schemaRefs>
-    <ds:schemaRef ds:uri="http://schemas.openxmlformats.org/officeDocument/2006/bibliography"/>
-  </ds:schemaRefs>
-</ds:datastoreItem>
 </file>
</xml_diff>